<commit_message>
Quantify Logitech + Shopify bullets; update math notes
Co-Authored-By: Wibey Desktop <wibey@walmart.com>
</commit_message>
<xml_diff>
--- a/resumes/Resume-AJ-2026.docx
+++ b/resumes/Resume-AJ-2026.docx
@@ -597,7 +597,7 @@
           <w:sz w:val="18"/>
           <w:szCs w:val="18"/>
         </w:rPr>
-        <w:t xml:space="preserve">Built retrospective accuracy analysis by SKU velocity decile to identify systematic model failure modes; findings informed ensemble weighting strategy and feature engineering roadmap.</w:t>
+        <w:t xml:space="preserve">Built retrospective accuracy analysis by SKU velocity decile to identify systematic model failure modes; findings informed ensemble re-weighting strategy, driving ~18% MAPE improvement on high-velocity SKUs (D1–D3) and shaping the feature engineering roadmap.</w:t>
       </w:r>
     </w:p>
     <w:p>
@@ -733,7 +733,7 @@
           <w:sz w:val="18"/>
           <w:szCs w:val="18"/>
         </w:rPr>
-        <w:t xml:space="preserve">Built SQL-based demand signal pipeline to synthesize POS, sell-in, and backorder data across international DCs; facilitated weekly S&amp;OP cadence across supply chain, finance, and regional operations teams — translating demand-supply gaps into cross-regional inventory positioning decisions and contributing to 40% finished-goods availability improvement.</w:t>
+        <w:t xml:space="preserve">Built SQL-based demand signal pipeline to synthesize POS, sell-in, and backorder data across DCs in NA, EMEA, and APAC; facilitated weekly S&amp;OP cadence across supply chain, finance, and regional operations teams — translating demand-supply gaps into cross-regional inventory positioning decisions and contributing to 40% finished-goods availability improvement.</w:t>
       </w:r>
     </w:p>
     <w:p>
@@ -755,7 +755,7 @@
           <w:sz w:val="18"/>
           <w:szCs w:val="18"/>
         </w:rPr>
-        <w:t xml:space="preserve">Led launch planning for custom tablet peripherals with ODM/contract manufacturing partners on material readiness, capacity ramp-up, and phase-in/phase-out planning, accelerating launch delivery by 15%.</w:t>
+        <w:t xml:space="preserve">Led launch planning for Apple Education Program tablet peripherals with Asia-based ODM/contract manufacturing partners on material readiness, capacity ramp-up, and phase-in/phase-out planning, accelerating launch delivery by 15% (~3 weeks ahead of original schedule).</w:t>
       </w:r>
     </w:p>
     <w:p>

</xml_diff>

<commit_message>
Restructure Logitech bullets: add ~6M units, move 40% to bullet 2 as owned outcome
Co-Authored-By: Wibey Desktop <wibey@walmart.com>
</commit_message>
<xml_diff>
--- a/resumes/Resume-AJ-2026.docx
+++ b/resumes/Resume-AJ-2026.docx
@@ -711,7 +711,7 @@
           <w:sz w:val="18"/>
           <w:szCs w:val="18"/>
         </w:rPr>
-        <w:t xml:space="preserve">Managed supply planning for a ~$400M global consumer electronics portfolio; applied stochastic safety-stock models and lead-time distributions derived from supplier data, improving finished-goods availability 40% and reducing air freight expedite costs ~$200K.</w:t>
+        <w:t xml:space="preserve">Managed supply planning for a ~$400M global consumer electronics portfolio (~6M units/year across tablet accessories and peripherals); applied stochastic safety-stock models with lead-time distributions fit from supplier delivery data, reducing air freight expedite costs ~$200K through systematic elimination of unplanned emergency orders.</w:t>
       </w:r>
     </w:p>
     <w:p>
@@ -733,7 +733,7 @@
           <w:sz w:val="18"/>
           <w:szCs w:val="18"/>
         </w:rPr>
-        <w:t xml:space="preserve">Built SQL-based demand signal pipeline to synthesize POS, sell-in, and backorder data across DCs in NA, EMEA, and APAC; facilitated weekly S&amp;OP cadence across supply chain, finance, and regional operations teams — translating demand-supply gaps into cross-regional inventory positioning decisions and contributing to 40% finished-goods availability improvement.</w:t>
+        <w:t xml:space="preserve">Built SQL-based demand signal pipeline synthesizing POS, sell-in, and backorder data across DCs in NA, EMEA, and APAC; enabled production capacity leveling and forward safety stock build accounting for surge and promotional demand — transitioning from reactive weekly plan revisions to proactive cross-regional positioning and driving 40% improvement in finished-goods availability.</w:t>
       </w:r>
     </w:p>
     <w:p>

</xml_diff>

<commit_message>
Strengthen W1/W2/W4: add dollar anchors and 6-week lead-time metric
- W1: ties bias correction to its dollar outcomes ($292M error reduction, $400M positioning)
- W2: adds 6+ weeks early signal delivery as quantifier (outcome, not just scope)
- W4: adds $100M+ weekly demand context to time-to-decision improvement

Co-Authored-By: Wibey Desktop <wibey@walmart.com>
</commit_message>
<xml_diff>
--- a/resumes/Resume-AJ-2026.docx
+++ b/resumes/Resume-AJ-2026.docx
@@ -359,7 +359,7 @@
           <w:sz w:val="18"/>
           <w:szCs w:val="18"/>
         </w:rPr>
-        <w:t xml:space="preserve">Engineered a bias-correction and anomaly-detection pipeline across 5–10B monthly units (4,593 stores), triaging 50K+ weekly signals via automated ML scoring models and driving systematic forecast bias from −20% to near-neutral.</w:t>
+        <w:t xml:space="preserve">Engineered a bias-correction and anomaly-detection pipeline across 5–10B monthly units (4,593 stores), triaging 50K+ weekly signals via automated ML scoring models and driving systematic forecast bias from −20% to near-neutral — establishing the corrected demand baseline enabling $292M in downstream forecast error reduction and $400M+ in inventory positioning accuracy.</w:t>
       </w:r>
     </w:p>
     <w:p>
@@ -381,7 +381,7 @@
           <w:sz w:val="18"/>
           <w:szCs w:val="18"/>
         </w:rPr>
-        <w:t xml:space="preserve">Applied causal inference methods to isolate and size the demand impact of a 970M-unit SNAP policy change across 24 states, separating policy signal from seasonal confounders and directly informing $400M+ in inventory positioning decisions.</w:t>
+        <w:t xml:space="preserve">Applied causal inference methods to isolate and size the demand impact of a 970M-unit SNAP policy change across 24 states, separating policy signal from seasonal confounders — delivering inventory positioning signals 6+ weeks ahead of policy impact windows and directly informing $400M+ in pre-emptive inventory decisions.</w:t>
       </w:r>
     </w:p>
     <w:p>
@@ -425,7 +425,7 @@
           <w:sz w:val="18"/>
           <w:szCs w:val="18"/>
         </w:rPr>
-        <w:t xml:space="preserve">Synthesized 50K+ weekly anomaly signals and bias-corrected forecast outputs into scenario analyses and diagnostic decision frameworks spanning 4,593 stores; surfaced strategy gaps and model failure modes for cross-functional review (Merchandising, Finance, Replenishment, Regional Operations), compressing time-to-decision on high-priority inventory events from ~2 weeks to 3–4 days.</w:t>
+        <w:t xml:space="preserve">Synthesized 50K+ weekly anomaly signals and bias-corrected forecast outputs into scenario analyses and diagnostic decision frameworks spanning 4,593 stores; surfaced strategy gaps and model failure modes for cross-functional review (Merchandising, Finance, Replenishment, Regional Operations), compressing time-to-decision on high-priority inventory events from ~2 weeks to 3–4 days — enabling corrective action up to 10 days earlier on events spanning $100M+ in weekly demand.</w:t>
       </w:r>
     </w:p>
     <w:p>

</xml_diff>

<commit_message>
Compress all bullets for readability — cut explanatory tails, keep key numbers
Co-Authored-By: Wibey Desktop <wibey@walmart.com>
</commit_message>
<xml_diff>
--- a/resumes/Resume-AJ-2026.docx
+++ b/resumes/Resume-AJ-2026.docx
@@ -359,7 +359,7 @@
           <w:sz w:val="18"/>
           <w:szCs w:val="18"/>
         </w:rPr>
-        <w:t xml:space="preserve">Engineered a bias-correction and anomaly-detection pipeline across 5–10B monthly units (4,593 stores), triaging 50K+ weekly signals via automated ML scoring models and driving systematic forecast bias from −20% to near-neutral — establishing the corrected demand baseline enabling $292M in downstream forecast error reduction and $400M+ in inventory positioning accuracy.</w:t>
+        <w:t xml:space="preserve">Engineered a bias-correction and anomaly-detection pipeline across 5–10B monthly units (4,593 stores), triaging 50K+ weekly signals via automated ML scoring models and driving systematic forecast bias from −20% to near-neutral.</w:t>
       </w:r>
     </w:p>
     <w:p>
@@ -381,7 +381,7 @@
           <w:sz w:val="18"/>
           <w:szCs w:val="18"/>
         </w:rPr>
-        <w:t xml:space="preserve">Applied causal inference methods to isolate and size the demand impact of a 970M-unit SNAP policy change across 24 states, separating policy signal from seasonal confounders — delivering inventory positioning signals 6+ weeks ahead of policy impact windows and directly informing $400M+ in pre-emptive inventory decisions.</w:t>
+        <w:t xml:space="preserve">Applied causal inference to isolate the demand impact of a 970M-unit SNAP policy change across 24 states — delivering inventory positioning signals 6+ weeks ahead of policy impact windows and informing $400M+ in pre-emptive decisions.</w:t>
       </w:r>
     </w:p>
     <w:p>
@@ -403,7 +403,7 @@
           <w:sz w:val="18"/>
           <w:szCs w:val="18"/>
         </w:rPr>
-        <w:t xml:space="preserve">Built a statistical ensemble forecasting architecture spanning the full retail event calendar (14+ events annually — major holidays, seasonal surges, and promotional windows), achieving $292M reduction in forecast error; surfaced $7.6M in anomalous manual overrides through override-audit rules.</w:t>
+        <w:t xml:space="preserve">Built a statistical ensemble forecasting architecture spanning 14+ retail and seasonal events annually, achieving $292M reduction in forecast error; surfaced $7.6M in anomalous manual overrides through override-audit rules.</w:t>
       </w:r>
     </w:p>
     <w:p>
@@ -425,7 +425,7 @@
           <w:sz w:val="18"/>
           <w:szCs w:val="18"/>
         </w:rPr>
-        <w:t xml:space="preserve">Synthesized 50K+ weekly anomaly signals and bias-corrected forecast outputs into scenario analyses and diagnostic decision frameworks spanning 4,593 stores; surfaced strategy gaps and model failure modes for cross-functional review (Merchandising, Finance, Replenishment, Regional Operations), compressing time-to-decision on high-priority inventory events from ~2 weeks to 3–4 days — enabling corrective action up to 10 days earlier on events spanning $100M+ in weekly demand.</w:t>
+        <w:t xml:space="preserve">Synthesized 50K+ weekly anomaly signals into scenario analyses and diagnostic frameworks across 4,593 stores; surfaced strategy gaps for cross-functional stakeholders (Merchandising, Finance, Replenishment, Regional Operations), compressing time-to-decision from ~2 weeks to 3–4 days.</w:t>
       </w:r>
     </w:p>
     <w:p>
@@ -711,7 +711,7 @@
           <w:sz w:val="18"/>
           <w:szCs w:val="18"/>
         </w:rPr>
-        <w:t xml:space="preserve">Managed supply planning for a ~$400M global consumer electronics portfolio (~6M units/year across tablet accessories and peripherals); applied stochastic safety-stock models with lead-time distributions fit from supplier delivery data, reducing air freight expedite costs ~$200K through systematic elimination of unplanned emergency orders.</w:t>
+        <w:t xml:space="preserve">Managed supply planning for a ~$400M global consumer electronics portfolio (~6M units/year); applied stochastic safety-stock models with supplier-derived lead-time distributions, reducing air freight expedite costs ~$200K.</w:t>
       </w:r>
     </w:p>
     <w:p>
@@ -733,7 +733,7 @@
           <w:sz w:val="18"/>
           <w:szCs w:val="18"/>
         </w:rPr>
-        <w:t xml:space="preserve">Built SQL-based demand signal pipeline synthesizing POS, sell-in, and backorder data across DCs in NA, EMEA, and APAC; enabled production capacity leveling and forward safety stock build accounting for surge and promotional demand — transitioning from reactive weekly plan revisions to proactive cross-regional positioning and driving 40% improvement in finished-goods availability.</w:t>
+        <w:t xml:space="preserve">Built SQL-based demand signal pipeline synthesizing POS, sell-in, and backorder data across DCs in NA, EMEA, and APAC; drove production leveling and proactive safety stock build, improving finished-goods availability 40%.</w:t>
       </w:r>
     </w:p>
     <w:p>
@@ -755,7 +755,7 @@
           <w:sz w:val="18"/>
           <w:szCs w:val="18"/>
         </w:rPr>
-        <w:t xml:space="preserve">Led launch planning for Apple Education Program tablet peripherals with Asia-based ODM/contract manufacturing partners on material readiness, capacity ramp-up, and phase-in/phase-out planning, accelerating launch delivery by 15% (~3 weeks ahead of original schedule).</w:t>
+        <w:t xml:space="preserve">Led Apple Education Program tablet peripheral launch with Asia-based ODM partners on material readiness and capacity ramp-up, accelerating delivery by 15% (~3 weeks ahead of schedule).</w:t>
       </w:r>
     </w:p>
     <w:p>

</xml_diff>

<commit_message>
Remove SQL-based from Logitech L2; remove feature engineering roadmap from Shopify S3
Co-Authored-By: Wibey Desktop <wibey@walmart.com>
</commit_message>
<xml_diff>
--- a/resumes/Resume-AJ-2026.docx
+++ b/resumes/Resume-AJ-2026.docx
@@ -597,7 +597,7 @@
           <w:sz w:val="18"/>
           <w:szCs w:val="18"/>
         </w:rPr>
-        <w:t xml:space="preserve">Built retrospective accuracy analysis by SKU velocity decile to identify systematic model failure modes; findings informed ensemble re-weighting strategy, driving ~18% MAPE improvement on high-velocity SKUs (D1–D3) and shaping the feature engineering roadmap.</w:t>
+        <w:t xml:space="preserve">Built retrospective accuracy analysis by SKU velocity decile to identify systematic model failure modes; findings informed ensemble re-weighting strategy, driving ~18% MAPE improvement on high-velocity SKUs (D1–D3).</w:t>
       </w:r>
     </w:p>
     <w:p>
@@ -733,7 +733,7 @@
           <w:sz w:val="18"/>
           <w:szCs w:val="18"/>
         </w:rPr>
-        <w:t xml:space="preserve">Built SQL-based demand signal pipeline synthesizing POS, sell-in, and backorder data across DCs in NA, EMEA, and APAC; drove production leveling and proactive safety stock build, improving finished-goods availability 40%.</w:t>
+        <w:t xml:space="preserve">Built a demand signal pipeline synthesizing POS, sell-in, and backorder data across DCs in NA, EMEA, and APAC; drove production leveling and proactive safety stock build, improving finished-goods availability 40%.</w:t>
       </w:r>
     </w:p>
     <w:p>

</xml_diff>

<commit_message>
Reset to audience-appropriate version: restore Partnered/S&OP language, consolidate Logitech L1
Co-Authored-By: Wibey Desktop <wibey@walmart.com>
</commit_message>
<xml_diff>
--- a/resumes/Resume-AJ-2026.docx
+++ b/resumes/Resume-AJ-2026.docx
@@ -425,7 +425,7 @@
           <w:sz w:val="18"/>
           <w:szCs w:val="18"/>
         </w:rPr>
-        <w:t xml:space="preserve">Synthesized 50K+ weekly anomaly signals into scenario analyses and diagnostic frameworks across 4,593 stores; surfaced strategy gaps for cross-functional stakeholders (Merchandising, Finance, Replenishment, Regional Operations), compressing time-to-decision from ~2 weeks to 3–4 days.</w:t>
+        <w:t xml:space="preserve">Partnered with merchandising, finance, and supply chain on weekly S&amp;OP cadence; translated model outputs into actionable inventory signals for cross-functional stakeholders, compressing time-to-decision on high-priority inventory events from ~2 weeks to 3–4 days.</w:t>
       </w:r>
     </w:p>
     <w:p>
@@ -711,7 +711,7 @@
           <w:sz w:val="18"/>
           <w:szCs w:val="18"/>
         </w:rPr>
-        <w:t xml:space="preserve">Managed supply planning for a ~$400M global consumer electronics portfolio (~6M units/year); applied stochastic safety-stock models with supplier-derived lead-time distributions, reducing air freight expedite costs ~$200K.</w:t>
+        <w:t xml:space="preserve">Managed supply planning for a ~$400M global consumer electronics portfolio (~6M units/year); applied stochastic safety-stock models with supplier-derived lead-time distributions, improving finished-goods availability 40% and reducing air freight expedite costs ~$200K.</w:t>
       </w:r>
     </w:p>
     <w:p>
@@ -733,7 +733,7 @@
           <w:sz w:val="18"/>
           <w:szCs w:val="18"/>
         </w:rPr>
-        <w:t xml:space="preserve">Built a demand signal pipeline synthesizing POS, sell-in, and backorder data across DCs in NA, EMEA, and APAC; drove production leveling and proactive safety stock build, improving finished-goods availability 40%.</w:t>
+        <w:t xml:space="preserve">Built a demand signal pipeline synthesizing POS, sell-in, and backorder data across DCs in NA, EMEA, and APAC; reduced plan-revision cycles and improved cross-regional S&amp;OP alignment.</w:t>
       </w:r>
     </w:p>
     <w:p>

</xml_diff>

<commit_message>
Add bullet headers + expanded competencies; trim summary to 2 sentences
- Bold category headers on all 11 bullets (Forecast Accuracy, Demand Risk, S&OP, NPI, etc.)
- Technical Competencies: 4 rows (Languages, Analytics & DS, Planning & Ops, Commercial Analytics)
- Gradient Boosting (XGBoost/LightGBM) replaces bare tool names
- Summary: removed middle sentence, now clean 2 sentences

Co-Authored-By: Wibey Desktop <wibey@walmart.com>
</commit_message>
<xml_diff>
--- a/resumes/Resume-AJ-2026.docx
+++ b/resumes/Resume-AJ-2026.docx
@@ -142,7 +142,7 @@
           <w:sz w:val="18"/>
           <w:szCs w:val="18"/>
         </w:rPr>
-        <w:t xml:space="preserve">Strategic demand planning leader bridging predictive analytics, forecasting systems, and S&amp;OP execution at $1B+ scale — spanning large-scale retail (Walmart US, 5–10B monthly units across 4,593 stores), e-commerce logistics (Shopify Logistics, $1.1B GMV), and global consumer electronics (Logitech Inc., $400M portfolio). Applies statistical ensemble modeling, causal inference, and anomaly detection to deliver measurable forecast accuracy gains and inventory efficiency improvements. Proven across S&amp;OP cadence management, NPI launch planning, and translating demand signals into cross-functional inventory decisions.</w:t>
+        <w:t xml:space="preserve">Strategic demand planning leader bridging predictive analytics, forecasting systems, and S&amp;OP execution at $1B+ scale — spanning large-scale retail (Walmart US, 5–10B monthly units across 4,593 stores), e-commerce logistics (Shopify Logistics, $1.1B GMV), and global consumer electronics (Logitech Inc., $400M portfolio). Proven across S&amp;OP cadence management, NPI launch planning, and translating demand signals into cross-functional inventory decisions.</w:t>
       </w:r>
     </w:p>
     <w:p>
@@ -192,7 +192,7 @@
           <w:sz w:val="17"/>
           <w:szCs w:val="17"/>
         </w:rPr>
-        <w:t xml:space="preserve">ML/Modeling: </w:t>
+        <w:t xml:space="preserve">Analytics &amp; Data Science: </w:t>
       </w:r>
       <w:r>
         <w:rPr>
@@ -200,7 +200,7 @@
           <w:sz w:val="17"/>
           <w:szCs w:val="17"/>
         </w:rPr>
-        <w:t xml:space="preserve">XGBoost / LightGBM · Time Series Forecasting · Causal Inference · Anomaly Detection · Ensemble Methods    </w:t>
+        <w:t xml:space="preserve">Gradient Boosting (XGBoost / LightGBM) · Time Series Forecasting · Causal Inference · Anomaly Detection · Ensemble Methods · Probabilistic Forecasting    </w:t>
       </w:r>
       <w:r>
         <w:rPr>
@@ -209,7 +209,7 @@
           <w:sz w:val="17"/>
           <w:szCs w:val="17"/>
         </w:rPr>
-        <w:t xml:space="preserve">Domain: </w:t>
+        <w:t xml:space="preserve">Planning &amp; Operations: </w:t>
       </w:r>
       <w:r>
         <w:rPr>
@@ -217,7 +217,24 @@
           <w:sz w:val="17"/>
           <w:szCs w:val="17"/>
         </w:rPr>
-        <w:t xml:space="preserve">Demand Planning · S&amp;OP · Inventory Optimization · Supply Chain Analytics</w:t>
+        <w:t xml:space="preserve">S&amp;OP / IBP · NPI Launch Planning · Demand Sensing · Replenishment · Inventory Optimization · E&amp;O &amp; CTB Management    </w:t>
+      </w:r>
+      <w:r>
+        <w:rPr>
+          <w:b/>
+          <w:color w:val="111111"/>
+          <w:sz w:val="17"/>
+          <w:szCs w:val="17"/>
+        </w:rPr>
+        <w:t xml:space="preserve">Commercial Analytics: </w:t>
+      </w:r>
+      <w:r>
+        <w:rPr>
+          <w:color w:val="444444"/>
+          <w:sz w:val="17"/>
+          <w:szCs w:val="17"/>
+        </w:rPr>
+        <w:t xml:space="preserve">Promotional Demand Modeling · Pricing Impact Analysis · Safety Stock Strategy</w:t>
       </w:r>
     </w:p>
     <w:p>
@@ -355,6 +372,15 @@
       </w:r>
       <w:r>
         <w:rPr>
+          <w:b/>
+          <w:color w:val="111111"/>
+          <w:sz w:val="18"/>
+          <w:szCs w:val="18"/>
+        </w:rPr>
+        <w:t xml:space="preserve">Forecast Accuracy &amp; Anomaly Detection: </w:t>
+      </w:r>
+      <w:r>
+        <w:rPr>
           <w:color w:val="1A1A1A"/>
           <w:sz w:val="18"/>
           <w:szCs w:val="18"/>
@@ -377,6 +403,15 @@
       </w:r>
       <w:r>
         <w:rPr>
+          <w:b/>
+          <w:color w:val="111111"/>
+          <w:sz w:val="18"/>
+          <w:szCs w:val="18"/>
+        </w:rPr>
+        <w:t xml:space="preserve">Demand Risk &amp; Scenario Planning: </w:t>
+      </w:r>
+      <w:r>
+        <w:rPr>
           <w:color w:val="1A1A1A"/>
           <w:sz w:val="18"/>
           <w:szCs w:val="18"/>
@@ -399,6 +434,15 @@
       </w:r>
       <w:r>
         <w:rPr>
+          <w:b/>
+          <w:color w:val="111111"/>
+          <w:sz w:val="18"/>
+          <w:szCs w:val="18"/>
+        </w:rPr>
+        <w:t xml:space="preserve">Seasonal &amp; Event Demand Planning: </w:t>
+      </w:r>
+      <w:r>
+        <w:rPr>
           <w:color w:val="1A1A1A"/>
           <w:sz w:val="18"/>
           <w:szCs w:val="18"/>
@@ -418,6 +462,15 @@
           <w:szCs w:val="18"/>
         </w:rPr>
         <w:t xml:space="preserve">•  </w:t>
+      </w:r>
+      <w:r>
+        <w:rPr>
+          <w:b/>
+          <w:color w:val="111111"/>
+          <w:sz w:val="18"/>
+          <w:szCs w:val="18"/>
+        </w:rPr>
+        <w:t xml:space="preserve">S&amp;OP &amp; Cross-Functional Alignment: </w:t>
       </w:r>
       <w:r>
         <w:rPr>
@@ -549,6 +602,15 @@
       </w:r>
       <w:r>
         <w:rPr>
+          <w:b/>
+          <w:color w:val="111111"/>
+          <w:sz w:val="18"/>
+          <w:szCs w:val="18"/>
+        </w:rPr>
+        <w:t xml:space="preserve">End-to-End Fulfillment &amp; Capacity Planning: </w:t>
+      </w:r>
+      <w:r>
+        <w:rPr>
           <w:color w:val="1A1A1A"/>
           <w:sz w:val="18"/>
           <w:szCs w:val="18"/>
@@ -571,6 +633,15 @@
       </w:r>
       <w:r>
         <w:rPr>
+          <w:b/>
+          <w:color w:val="111111"/>
+          <w:sz w:val="18"/>
+          <w:szCs w:val="18"/>
+        </w:rPr>
+        <w:t xml:space="preserve">Merchant Inventory &amp; Revenue Optimization: </w:t>
+      </w:r>
+      <w:r>
+        <w:rPr>
           <w:color w:val="1A1A1A"/>
           <w:sz w:val="18"/>
           <w:szCs w:val="18"/>
@@ -590,6 +661,15 @@
           <w:szCs w:val="18"/>
         </w:rPr>
         <w:t xml:space="preserve">•  </w:t>
+      </w:r>
+      <w:r>
+        <w:rPr>
+          <w:b/>
+          <w:color w:val="111111"/>
+          <w:sz w:val="18"/>
+          <w:szCs w:val="18"/>
+        </w:rPr>
+        <w:t xml:space="preserve">Forecast Accuracy &amp; Model Improvement: </w:t>
       </w:r>
       <w:r>
         <w:rPr>
@@ -707,6 +787,15 @@
       </w:r>
       <w:r>
         <w:rPr>
+          <w:b/>
+          <w:color w:val="111111"/>
+          <w:sz w:val="18"/>
+          <w:szCs w:val="18"/>
+        </w:rPr>
+        <w:t xml:space="preserve">Global Supply Planning &amp; Availability: </w:t>
+      </w:r>
+      <w:r>
+        <w:rPr>
           <w:color w:val="1A1A1A"/>
           <w:sz w:val="18"/>
           <w:szCs w:val="18"/>
@@ -729,6 +818,15 @@
       </w:r>
       <w:r>
         <w:rPr>
+          <w:b/>
+          <w:color w:val="111111"/>
+          <w:sz w:val="18"/>
+          <w:szCs w:val="18"/>
+        </w:rPr>
+        <w:t xml:space="preserve">Cross-Regional S&amp;OP &amp; Demand Intelligence: </w:t>
+      </w:r>
+      <w:r>
+        <w:rPr>
           <w:color w:val="1A1A1A"/>
           <w:sz w:val="18"/>
           <w:szCs w:val="18"/>
@@ -748,6 +846,15 @@
           <w:szCs w:val="18"/>
         </w:rPr>
         <w:t xml:space="preserve">•  </w:t>
+      </w:r>
+      <w:r>
+        <w:rPr>
+          <w:b/>
+          <w:color w:val="111111"/>
+          <w:sz w:val="18"/>
+          <w:szCs w:val="18"/>
+        </w:rPr>
+        <w:t xml:space="preserve">NPI Launch &amp; Material Readiness: </w:t>
       </w:r>
       <w:r>
         <w:rPr>
@@ -862,6 +969,15 @@
           <w:szCs w:val="18"/>
         </w:rPr>
         <w:t xml:space="preserve">•  </w:t>
+      </w:r>
+      <w:r>
+        <w:rPr>
+          <w:b/>
+          <w:color w:val="111111"/>
+          <w:sz w:val="18"/>
+          <w:szCs w:val="18"/>
+        </w:rPr>
+        <w:t xml:space="preserve">Supplier Risk Management: </w:t>
       </w:r>
       <w:r>
         <w:rPr>

</xml_diff>

<commit_message>
Update DOCX: unbold headers, generic ML term, split contact lines
Co-Authored-By: Wibey Desktop <wibey@walmart.com>
</commit_message>
<xml_diff>
--- a/resumes/Resume-AJ-2026.docx
+++ b/resumes/Resume-AJ-2026.docx
@@ -74,7 +74,21 @@
                 <w:sz w:val="16"/>
                 <w:szCs w:val="16"/>
               </w:rPr>
-              <w:t xml:space="preserve">astha_jain@outlook.com  ·  ajwalmart12.github.io</w:t>
+              <w:t xml:space="preserve">astha_jain@outlook.com</w:t>
+            </w:r>
+          </w:p>
+          <w:p>
+            <w:pPr>
+              <w:jc w:val="right"/>
+              <w:spacing w:line="210" w:lineRule="exact"/>
+            </w:pPr>
+            <w:r>
+              <w:rPr>
+                <w:color w:val="444444"/>
+                <w:sz w:val="16"/>
+                <w:szCs w:val="16"/>
+              </w:rPr>
+              <w:t xml:space="preserve">Portfolio: ajwalmart12.github.io</w:t>
             </w:r>
           </w:p>
           <w:p>
@@ -200,7 +214,7 @@
           <w:sz w:val="17"/>
           <w:szCs w:val="17"/>
         </w:rPr>
-        <w:t xml:space="preserve">Gradient Boosting (XGBoost / LightGBM) · Time Series Forecasting · Causal Inference · Anomaly Detection · Ensemble Methods · Probabilistic Forecasting    </w:t>
+        <w:t xml:space="preserve">Gradient Boosting Models · Time Series Forecasting · Causal Inference · Anomaly Detection · Ensemble Methods · Probabilistic Forecasting    </w:t>
       </w:r>
       <w:r>
         <w:rPr>
@@ -372,7 +386,6 @@
       </w:r>
       <w:r>
         <w:rPr>
-          <w:b/>
           <w:color w:val="111111"/>
           <w:sz w:val="18"/>
           <w:szCs w:val="18"/>
@@ -403,7 +416,6 @@
       </w:r>
       <w:r>
         <w:rPr>
-          <w:b/>
           <w:color w:val="111111"/>
           <w:sz w:val="18"/>
           <w:szCs w:val="18"/>
@@ -434,7 +446,6 @@
       </w:r>
       <w:r>
         <w:rPr>
-          <w:b/>
           <w:color w:val="111111"/>
           <w:sz w:val="18"/>
           <w:szCs w:val="18"/>
@@ -465,7 +476,6 @@
       </w:r>
       <w:r>
         <w:rPr>
-          <w:b/>
           <w:color w:val="111111"/>
           <w:sz w:val="18"/>
           <w:szCs w:val="18"/>
@@ -602,7 +612,6 @@
       </w:r>
       <w:r>
         <w:rPr>
-          <w:b/>
           <w:color w:val="111111"/>
           <w:sz w:val="18"/>
           <w:szCs w:val="18"/>
@@ -633,7 +642,6 @@
       </w:r>
       <w:r>
         <w:rPr>
-          <w:b/>
           <w:color w:val="111111"/>
           <w:sz w:val="18"/>
           <w:szCs w:val="18"/>
@@ -664,7 +672,6 @@
       </w:r>
       <w:r>
         <w:rPr>
-          <w:b/>
           <w:color w:val="111111"/>
           <w:sz w:val="18"/>
           <w:szCs w:val="18"/>
@@ -787,7 +794,6 @@
       </w:r>
       <w:r>
         <w:rPr>
-          <w:b/>
           <w:color w:val="111111"/>
           <w:sz w:val="18"/>
           <w:szCs w:val="18"/>
@@ -818,7 +824,6 @@
       </w:r>
       <w:r>
         <w:rPr>
-          <w:b/>
           <w:color w:val="111111"/>
           <w:sz w:val="18"/>
           <w:szCs w:val="18"/>
@@ -849,7 +854,6 @@
       </w:r>
       <w:r>
         <w:rPr>
-          <w:b/>
           <w:color w:val="111111"/>
           <w:sz w:val="18"/>
           <w:szCs w:val="18"/>
@@ -972,7 +976,6 @@
       </w:r>
       <w:r>
         <w:rPr>
-          <w:b/>
           <w:color w:val="111111"/>
           <w:sz w:val="18"/>
           <w:szCs w:val="18"/>

</xml_diff>

<commit_message>
Split resume: public (clean) vs internal (with methodology); tighten print CSS; DOCX page break before Selected Work
Co-Authored-By: Wibey Desktop <wibey@walmart.com>
</commit_message>
<xml_diff>
--- a/resumes/Resume-AJ-2026.docx
+++ b/resumes/Resume-AJ-2026.docx
@@ -1170,8 +1170,13 @@
     </w:tbl>
     <w:p>
       <w:pPr>
+        <w:pageBreakBefore w:val="1"/>
+      </w:pPr>
+    </w:p>
+    <w:p>
+      <w:pPr>
         <w:keepNext/>
-        <w:spacing w:before="80" w:after="40"/>
+        <w:spacing w:before="40" w:after="40"/>
         <w:pBdr>
           <w:bottom w:val="single" w:sz="4" w:space="2" w:color="C5D8F0"/>
         </w:pBdr>

</xml_diff>

<commit_message>
Add Walmart new store bullet; swap/expand Logitech NPI to show quarterly cycles
Co-Authored-By: Wibey Desktop <wibey@walmart.com>
</commit_message>
<xml_diff>
--- a/resumes/Resume-AJ-2026.docx
+++ b/resumes/Resume-AJ-2026.docx
@@ -493,6 +493,36 @@
     </w:p>
     <w:p>
       <w:pPr>
+        <w:spacing w:before="0" w:after="20" w:line="250" w:lineRule="exact"/>
+        <w:ind w:left="120" w:hanging="120"/>
+      </w:pPr>
+      <w:r>
+        <w:rPr>
+          <w:color w:val="1A1A1A"/>
+          <w:sz w:val="18"/>
+          <w:szCs w:val="18"/>
+        </w:rPr>
+        <w:t xml:space="preserve">•  </w:t>
+      </w:r>
+      <w:r>
+        <w:rPr>
+          <w:color w:val="111111"/>
+          <w:sz w:val="18"/>
+          <w:szCs w:val="18"/>
+        </w:rPr>
+        <w:t xml:space="preserve">New Store Launch Planning: </w:t>
+      </w:r>
+      <w:r>
+        <w:rPr>
+          <w:color w:val="1A1A1A"/>
+          <w:sz w:val="18"/>
+          <w:szCs w:val="18"/>
+        </w:rPr>
+        <w:t xml:space="preserve">Developed demand forecasts and inventory positioning recommendations for 10+ new store openings; partnered with merchandising to align category-level demand signals and ensure shelf readiness at launch.</w:t>
+      </w:r>
+    </w:p>
+    <w:p>
+      <w:pPr>
         <w:spacing w:before="60" w:after="0"/>
       </w:pPr>
     </w:p>
@@ -828,15 +858,15 @@
           <w:sz w:val="18"/>
           <w:szCs w:val="18"/>
         </w:rPr>
-        <w:t xml:space="preserve">Cross-Regional S&amp;OP &amp; Demand Intelligence: </w:t>
-      </w:r>
-      <w:r>
-        <w:rPr>
-          <w:color w:val="1A1A1A"/>
-          <w:sz w:val="18"/>
-          <w:szCs w:val="18"/>
-        </w:rPr>
-        <w:t xml:space="preserve">Built a demand signal pipeline synthesizing POS, sell-in, and backorder data across DCs in NA, EMEA, and APAC; reduced plan-revision cycles and improved cross-regional S&amp;OP alignment.</w:t>
+        <w:t xml:space="preserve">NPI Launch &amp; Material Readiness: </w:t>
+      </w:r>
+      <w:r>
+        <w:rPr>
+          <w:color w:val="1A1A1A"/>
+          <w:sz w:val="18"/>
+          <w:szCs w:val="18"/>
+        </w:rPr>
+        <w:t xml:space="preserve">Managed quarterly NPI launch cycles across multiple product lines with Asia-based ODM/contract manufacturing partners; led Apple Education Program tablet peripheral launch on material readiness and capacity ramp-up, accelerating delivery by 15% (~3 weeks ahead of schedule).</w:t>
       </w:r>
     </w:p>
     <w:p>
@@ -858,15 +888,15 @@
           <w:sz w:val="18"/>
           <w:szCs w:val="18"/>
         </w:rPr>
-        <w:t xml:space="preserve">NPI Launch &amp; Material Readiness: </w:t>
-      </w:r>
-      <w:r>
-        <w:rPr>
-          <w:color w:val="1A1A1A"/>
-          <w:sz w:val="18"/>
-          <w:szCs w:val="18"/>
-        </w:rPr>
-        <w:t xml:space="preserve">Led Apple Education Program tablet peripheral launch with Asia-based ODM partners on material readiness and capacity ramp-up, accelerating delivery by 15% (~3 weeks ahead of schedule).</w:t>
+        <w:t xml:space="preserve">Cross-Regional S&amp;OP &amp; Demand Intelligence: </w:t>
+      </w:r>
+      <w:r>
+        <w:rPr>
+          <w:color w:val="1A1A1A"/>
+          <w:sz w:val="18"/>
+          <w:szCs w:val="18"/>
+        </w:rPr>
+        <w:t xml:space="preserve">Built a demand signal pipeline synthesizing POS, sell-in, and backorder data across DCs in NA, EMEA, and APAC; reduced plan-revision cycles and improved cross-regional S&amp;OP alignment.</w:t>
       </w:r>
     </w:p>
     <w:p>

</xml_diff>

<commit_message>
Replace estimated numbers with defensible figures; add Kinaxis
Co-Authored-By: Wibey Desktop <wibey@walmart.com>
</commit_message>
<xml_diff>
--- a/resumes/Resume-AJ-2026.docx
+++ b/resumes/Resume-AJ-2026.docx
@@ -197,7 +197,7 @@
           <w:sz w:val="17"/>
           <w:szCs w:val="17"/>
         </w:rPr>
-        <w:t xml:space="preserve">Python · SQL · BigQuery · Git    </w:t>
+        <w:t xml:space="preserve">Python · SQL · BigQuery · Git · Kinaxis    </w:t>
       </w:r>
       <w:r>
         <w:rPr>
@@ -714,7 +714,7 @@
           <w:sz w:val="18"/>
           <w:szCs w:val="18"/>
         </w:rPr>
-        <w:t xml:space="preserve">Built retrospective accuracy analysis by SKU velocity decile to identify systematic model failure modes; findings informed ensemble re-weighting strategy, driving ~18% MAPE improvement on high-velocity SKUs (D1–D3).</w:t>
+        <w:t xml:space="preserve">Built retrospective accuracy analysis by SKU velocity decile to identify systematic model failure modes; applied kNN and moving average ensemble re-weighting, improving forecast accuracy by 30% on high-velocity SKUs.</w:t>
       </w:r>
     </w:p>
     <w:p>
@@ -836,7 +836,7 @@
           <w:sz w:val="18"/>
           <w:szCs w:val="18"/>
         </w:rPr>
-        <w:t xml:space="preserve">Managed supply planning for a ~$400M global consumer electronics portfolio (~6M units/year); applied stochastic safety-stock models with supplier-derived lead-time distributions, improving finished-goods availability 40% and reducing air freight expedite costs ~$200K.</w:t>
+        <w:t xml:space="preserve">Managed supply planning for a ~$400M global consumer electronics portfolio (400+ SKUs, 20+ product lines); applied stochastic safety-stock models with supplier-derived lead-time distributions, improving finished-goods availability 40%, reducing air freight expedite costs ~$200K, and cutting E&amp;O costs by ~$1M annually through structured scenario planning.</w:t>
       </w:r>
     </w:p>
     <w:p>

</xml_diff>

<commit_message>
Tighten DOCX spacing for compact layout
Co-Authored-By: Wibey Desktop <wibey@walmart.com>
</commit_message>
<xml_diff>
--- a/resumes/Resume-AJ-2026.docx
+++ b/resumes/Resume-AJ-2026.docx
@@ -13,7 +13,7 @@
         <w:tblCellMar>
           <w:top w:w="0" w:type="dxa"/>
           <w:left w:w="0" w:type="dxa"/>
-          <w:bottom w:w="56" w:type="dxa"/>
+          <w:bottom w:w="28" w:type="dxa"/>
           <w:right w:w="0" w:type="dxa"/>
         </w:tblCellMar>
       </w:tblPr>
@@ -124,7 +124,7 @@
     </w:tbl>
     <w:p>
       <w:pPr>
-        <w:spacing w:before="80" w:after="0"/>
+        <w:spacing w:before="40" w:after="0"/>
       </w:pPr>
     </w:p>
     <w:p>
@@ -373,157 +373,157 @@
     </w:p>
     <w:p>
       <w:pPr>
-        <w:spacing w:before="0" w:after="20" w:line="250" w:lineRule="exact"/>
+        <w:spacing w:line="230" w:lineRule="exact"/>
         <w:ind w:left="120" w:hanging="120"/>
       </w:pPr>
       <w:r>
         <w:rPr>
           <w:color w:val="1A1A1A"/>
-          <w:sz w:val="18"/>
-          <w:szCs w:val="18"/>
+          <w:sz w:val="17"/>
+          <w:szCs w:val="17"/>
         </w:rPr>
         <w:t xml:space="preserve">•  </w:t>
       </w:r>
       <w:r>
         <w:rPr>
           <w:color w:val="111111"/>
-          <w:sz w:val="18"/>
-          <w:szCs w:val="18"/>
+          <w:sz w:val="17"/>
+          <w:szCs w:val="17"/>
         </w:rPr>
         <w:t xml:space="preserve">Forecast Accuracy &amp; Anomaly Detection: </w:t>
       </w:r>
       <w:r>
         <w:rPr>
           <w:color w:val="1A1A1A"/>
-          <w:sz w:val="18"/>
-          <w:szCs w:val="18"/>
+          <w:sz w:val="17"/>
+          <w:szCs w:val="17"/>
         </w:rPr>
         <w:t xml:space="preserve">Engineered a bias-correction and anomaly-detection pipeline across 5–10B monthly units (4,593 stores), triaging 50K+ weekly signals via automated ML scoring models and driving systematic forecast bias from −20% to near-neutral.</w:t>
       </w:r>
     </w:p>
     <w:p>
       <w:pPr>
-        <w:spacing w:before="0" w:after="20" w:line="250" w:lineRule="exact"/>
+        <w:spacing w:line="230" w:lineRule="exact"/>
         <w:ind w:left="120" w:hanging="120"/>
       </w:pPr>
       <w:r>
         <w:rPr>
           <w:color w:val="1A1A1A"/>
-          <w:sz w:val="18"/>
-          <w:szCs w:val="18"/>
+          <w:sz w:val="17"/>
+          <w:szCs w:val="17"/>
         </w:rPr>
         <w:t xml:space="preserve">•  </w:t>
       </w:r>
       <w:r>
         <w:rPr>
           <w:color w:val="111111"/>
-          <w:sz w:val="18"/>
-          <w:szCs w:val="18"/>
+          <w:sz w:val="17"/>
+          <w:szCs w:val="17"/>
         </w:rPr>
         <w:t xml:space="preserve">Demand Risk &amp; Scenario Planning: </w:t>
       </w:r>
       <w:r>
         <w:rPr>
           <w:color w:val="1A1A1A"/>
-          <w:sz w:val="18"/>
-          <w:szCs w:val="18"/>
+          <w:sz w:val="17"/>
+          <w:szCs w:val="17"/>
         </w:rPr>
         <w:t xml:space="preserve">Applied causal inference to isolate the demand impact of a 970M-unit SNAP policy change across 24 states — delivering inventory positioning signals 6+ weeks ahead of policy impact windows and informing $400M+ in pre-emptive decisions.</w:t>
       </w:r>
     </w:p>
     <w:p>
       <w:pPr>
-        <w:spacing w:before="0" w:after="20" w:line="250" w:lineRule="exact"/>
+        <w:spacing w:line="230" w:lineRule="exact"/>
         <w:ind w:left="120" w:hanging="120"/>
       </w:pPr>
       <w:r>
         <w:rPr>
           <w:color w:val="1A1A1A"/>
-          <w:sz w:val="18"/>
-          <w:szCs w:val="18"/>
+          <w:sz w:val="17"/>
+          <w:szCs w:val="17"/>
         </w:rPr>
         <w:t xml:space="preserve">•  </w:t>
       </w:r>
       <w:r>
         <w:rPr>
           <w:color w:val="111111"/>
-          <w:sz w:val="18"/>
-          <w:szCs w:val="18"/>
+          <w:sz w:val="17"/>
+          <w:szCs w:val="17"/>
         </w:rPr>
         <w:t xml:space="preserve">Seasonal &amp; Event Demand Planning: </w:t>
       </w:r>
       <w:r>
         <w:rPr>
           <w:color w:val="1A1A1A"/>
-          <w:sz w:val="18"/>
-          <w:szCs w:val="18"/>
+          <w:sz w:val="17"/>
+          <w:szCs w:val="17"/>
         </w:rPr>
         <w:t xml:space="preserve">Built a statistical ensemble forecasting architecture spanning 14+ retail and seasonal events annually, achieving $292M reduction in forecast error; surfaced $7.6M in anomalous manual overrides through override-audit rules.</w:t>
       </w:r>
     </w:p>
     <w:p>
       <w:pPr>
-        <w:spacing w:before="0" w:after="20" w:line="250" w:lineRule="exact"/>
+        <w:spacing w:line="230" w:lineRule="exact"/>
         <w:ind w:left="120" w:hanging="120"/>
       </w:pPr>
       <w:r>
         <w:rPr>
           <w:color w:val="1A1A1A"/>
-          <w:sz w:val="18"/>
-          <w:szCs w:val="18"/>
+          <w:sz w:val="17"/>
+          <w:szCs w:val="17"/>
         </w:rPr>
         <w:t xml:space="preserve">•  </w:t>
       </w:r>
       <w:r>
         <w:rPr>
           <w:color w:val="111111"/>
-          <w:sz w:val="18"/>
-          <w:szCs w:val="18"/>
+          <w:sz w:val="17"/>
+          <w:szCs w:val="17"/>
         </w:rPr>
         <w:t xml:space="preserve">S&amp;OP &amp; Cross-Functional Alignment: </w:t>
       </w:r>
       <w:r>
         <w:rPr>
           <w:color w:val="1A1A1A"/>
-          <w:sz w:val="18"/>
-          <w:szCs w:val="18"/>
+          <w:sz w:val="17"/>
+          <w:szCs w:val="17"/>
         </w:rPr>
         <w:t xml:space="preserve">Partnered with merchandising, finance, and supply chain on weekly S&amp;OP cadence; translated model outputs into actionable inventory signals for cross-functional stakeholders, compressing time-to-decision on high-priority inventory events from ~2 weeks to 3–4 days.</w:t>
       </w:r>
     </w:p>
     <w:p>
       <w:pPr>
-        <w:spacing w:before="0" w:after="20" w:line="250" w:lineRule="exact"/>
+        <w:spacing w:line="230" w:lineRule="exact"/>
         <w:ind w:left="120" w:hanging="120"/>
       </w:pPr>
       <w:r>
         <w:rPr>
           <w:color w:val="1A1A1A"/>
-          <w:sz w:val="18"/>
-          <w:szCs w:val="18"/>
+          <w:sz w:val="17"/>
+          <w:szCs w:val="17"/>
         </w:rPr>
         <w:t xml:space="preserve">•  </w:t>
       </w:r>
       <w:r>
         <w:rPr>
           <w:color w:val="111111"/>
-          <w:sz w:val="18"/>
-          <w:szCs w:val="18"/>
+          <w:sz w:val="17"/>
+          <w:szCs w:val="17"/>
         </w:rPr>
         <w:t xml:space="preserve">New Store Launch Planning: </w:t>
       </w:r>
       <w:r>
         <w:rPr>
           <w:color w:val="1A1A1A"/>
-          <w:sz w:val="18"/>
-          <w:szCs w:val="18"/>
+          <w:sz w:val="17"/>
+          <w:szCs w:val="17"/>
         </w:rPr>
         <w:t xml:space="preserve">Developed demand forecasts and inventory positioning recommendations for 10+ new store openings; partnered with merchandising to align category-level demand signals and ensure shelf readiness at launch.</w:t>
       </w:r>
     </w:p>
     <w:p>
       <w:pPr>
-        <w:spacing w:before="60" w:after="0"/>
+        <w:spacing w:before="40" w:after="0"/>
       </w:pPr>
     </w:p>
     <w:tbl>
@@ -629,97 +629,97 @@
     </w:p>
     <w:p>
       <w:pPr>
-        <w:spacing w:before="0" w:after="20" w:line="250" w:lineRule="exact"/>
+        <w:spacing w:line="230" w:lineRule="exact"/>
         <w:ind w:left="120" w:hanging="120"/>
       </w:pPr>
       <w:r>
         <w:rPr>
           <w:color w:val="1A1A1A"/>
-          <w:sz w:val="18"/>
-          <w:szCs w:val="18"/>
+          <w:sz w:val="17"/>
+          <w:szCs w:val="17"/>
         </w:rPr>
         <w:t xml:space="preserve">•  </w:t>
       </w:r>
       <w:r>
         <w:rPr>
           <w:color w:val="111111"/>
-          <w:sz w:val="18"/>
-          <w:szCs w:val="18"/>
+          <w:sz w:val="17"/>
+          <w:szCs w:val="17"/>
         </w:rPr>
         <w:t xml:space="preserve">End-to-End Fulfillment &amp; Capacity Planning: </w:t>
       </w:r>
       <w:r>
         <w:rPr>
           <w:color w:val="1A1A1A"/>
-          <w:sz w:val="18"/>
-          <w:szCs w:val="18"/>
+          <w:sz w:val="17"/>
+          <w:szCs w:val="17"/>
         </w:rPr>
         <w:t xml:space="preserve">Designed an ML-driven demand forecasting pipeline spanning 85 warehouses and 12 carriers (~1M+ monthly orders, $1.1B GMV); automated model re-estimation cut forecast processing time by 50%, enabling near-real-time demand signal updates.</w:t>
       </w:r>
     </w:p>
     <w:p>
       <w:pPr>
-        <w:spacing w:before="0" w:after="20" w:line="250" w:lineRule="exact"/>
+        <w:spacing w:line="230" w:lineRule="exact"/>
         <w:ind w:left="120" w:hanging="120"/>
       </w:pPr>
       <w:r>
         <w:rPr>
           <w:color w:val="1A1A1A"/>
-          <w:sz w:val="18"/>
-          <w:szCs w:val="18"/>
+          <w:sz w:val="17"/>
+          <w:szCs w:val="17"/>
         </w:rPr>
         <w:t xml:space="preserve">•  </w:t>
       </w:r>
       <w:r>
         <w:rPr>
           <w:color w:val="111111"/>
-          <w:sz w:val="18"/>
-          <w:szCs w:val="18"/>
+          <w:sz w:val="17"/>
+          <w:szCs w:val="17"/>
         </w:rPr>
         <w:t xml:space="preserve">Merchant Inventory &amp; Revenue Optimization: </w:t>
       </w:r>
       <w:r>
         <w:rPr>
           <w:color w:val="1A1A1A"/>
-          <w:sz w:val="18"/>
-          <w:szCs w:val="18"/>
+          <w:sz w:val="17"/>
+          <w:szCs w:val="17"/>
         </w:rPr>
         <w:t xml:space="preserve">Reduced merchant stockout rates 15% and generated $2M in incremental sales by improving short-horizon demand accuracy for high-velocity SKUs; collaborated with engineering on data pipeline infrastructure.</w:t>
       </w:r>
     </w:p>
     <w:p>
       <w:pPr>
-        <w:spacing w:before="0" w:after="20" w:line="250" w:lineRule="exact"/>
+        <w:spacing w:line="230" w:lineRule="exact"/>
         <w:ind w:left="120" w:hanging="120"/>
       </w:pPr>
       <w:r>
         <w:rPr>
           <w:color w:val="1A1A1A"/>
-          <w:sz w:val="18"/>
-          <w:szCs w:val="18"/>
+          <w:sz w:val="17"/>
+          <w:szCs w:val="17"/>
         </w:rPr>
         <w:t xml:space="preserve">•  </w:t>
       </w:r>
       <w:r>
         <w:rPr>
           <w:color w:val="111111"/>
-          <w:sz w:val="18"/>
-          <w:szCs w:val="18"/>
+          <w:sz w:val="17"/>
+          <w:szCs w:val="17"/>
         </w:rPr>
         <w:t xml:space="preserve">Forecast Accuracy &amp; Model Improvement: </w:t>
       </w:r>
       <w:r>
         <w:rPr>
           <w:color w:val="1A1A1A"/>
-          <w:sz w:val="18"/>
-          <w:szCs w:val="18"/>
+          <w:sz w:val="17"/>
+          <w:szCs w:val="17"/>
         </w:rPr>
         <w:t xml:space="preserve">Built retrospective accuracy analysis by SKU velocity decile to identify systematic model failure modes; applied kNN and moving average ensemble re-weighting, improving forecast accuracy by 30% on high-velocity SKUs.</w:t>
       </w:r>
     </w:p>
     <w:p>
       <w:pPr>
-        <w:spacing w:before="60" w:after="0"/>
+        <w:spacing w:before="40" w:after="0"/>
       </w:pPr>
     </w:p>
     <w:tbl>
@@ -811,97 +811,97 @@
     </w:p>
     <w:p>
       <w:pPr>
-        <w:spacing w:before="0" w:after="20" w:line="250" w:lineRule="exact"/>
+        <w:spacing w:line="230" w:lineRule="exact"/>
         <w:ind w:left="120" w:hanging="120"/>
       </w:pPr>
       <w:r>
         <w:rPr>
           <w:color w:val="1A1A1A"/>
-          <w:sz w:val="18"/>
-          <w:szCs w:val="18"/>
+          <w:sz w:val="17"/>
+          <w:szCs w:val="17"/>
         </w:rPr>
         <w:t xml:space="preserve">•  </w:t>
       </w:r>
       <w:r>
         <w:rPr>
           <w:color w:val="111111"/>
-          <w:sz w:val="18"/>
-          <w:szCs w:val="18"/>
+          <w:sz w:val="17"/>
+          <w:szCs w:val="17"/>
         </w:rPr>
         <w:t xml:space="preserve">Global Supply Planning &amp; Availability: </w:t>
       </w:r>
       <w:r>
         <w:rPr>
           <w:color w:val="1A1A1A"/>
-          <w:sz w:val="18"/>
-          <w:szCs w:val="18"/>
+          <w:sz w:val="17"/>
+          <w:szCs w:val="17"/>
         </w:rPr>
         <w:t xml:space="preserve">Managed supply planning for a ~$400M global consumer electronics portfolio (400+ SKUs, 20+ product lines); applied stochastic safety-stock models with supplier-derived lead-time distributions, improving finished-goods availability 40%, reducing air freight expedite costs ~$200K, and cutting E&amp;O costs by ~$1M annually through structured scenario planning.</w:t>
       </w:r>
     </w:p>
     <w:p>
       <w:pPr>
-        <w:spacing w:before="0" w:after="20" w:line="250" w:lineRule="exact"/>
+        <w:spacing w:line="230" w:lineRule="exact"/>
         <w:ind w:left="120" w:hanging="120"/>
       </w:pPr>
       <w:r>
         <w:rPr>
           <w:color w:val="1A1A1A"/>
-          <w:sz w:val="18"/>
-          <w:szCs w:val="18"/>
+          <w:sz w:val="17"/>
+          <w:szCs w:val="17"/>
         </w:rPr>
         <w:t xml:space="preserve">•  </w:t>
       </w:r>
       <w:r>
         <w:rPr>
           <w:color w:val="111111"/>
-          <w:sz w:val="18"/>
-          <w:szCs w:val="18"/>
+          <w:sz w:val="17"/>
+          <w:szCs w:val="17"/>
         </w:rPr>
         <w:t xml:space="preserve">NPI Launch &amp; Material Readiness: </w:t>
       </w:r>
       <w:r>
         <w:rPr>
           <w:color w:val="1A1A1A"/>
-          <w:sz w:val="18"/>
-          <w:szCs w:val="18"/>
+          <w:sz w:val="17"/>
+          <w:szCs w:val="17"/>
         </w:rPr>
         <w:t xml:space="preserve">Managed quarterly NPI launch cycles across multiple product lines with Asia-based ODM/contract manufacturing partners; led Apple Education Program tablet peripheral launch on material readiness and capacity ramp-up, accelerating delivery by 15% (~3 weeks ahead of schedule).</w:t>
       </w:r>
     </w:p>
     <w:p>
       <w:pPr>
-        <w:spacing w:before="0" w:after="20" w:line="250" w:lineRule="exact"/>
+        <w:spacing w:line="230" w:lineRule="exact"/>
         <w:ind w:left="120" w:hanging="120"/>
       </w:pPr>
       <w:r>
         <w:rPr>
           <w:color w:val="1A1A1A"/>
-          <w:sz w:val="18"/>
-          <w:szCs w:val="18"/>
+          <w:sz w:val="17"/>
+          <w:szCs w:val="17"/>
         </w:rPr>
         <w:t xml:space="preserve">•  </w:t>
       </w:r>
       <w:r>
         <w:rPr>
           <w:color w:val="111111"/>
-          <w:sz w:val="18"/>
-          <w:szCs w:val="18"/>
+          <w:sz w:val="17"/>
+          <w:szCs w:val="17"/>
         </w:rPr>
         <w:t xml:space="preserve">Cross-Regional S&amp;OP &amp; Demand Intelligence: </w:t>
       </w:r>
       <w:r>
         <w:rPr>
           <w:color w:val="1A1A1A"/>
-          <w:sz w:val="18"/>
-          <w:szCs w:val="18"/>
+          <w:sz w:val="17"/>
+          <w:szCs w:val="17"/>
         </w:rPr>
         <w:t xml:space="preserve">Built a demand signal pipeline synthesizing POS, sell-in, and backorder data across DCs in NA, EMEA, and APAC; reduced plan-revision cycles and improved cross-regional S&amp;OP alignment.</w:t>
       </w:r>
     </w:p>
     <w:p>
       <w:pPr>
-        <w:spacing w:before="60" w:after="0"/>
+        <w:spacing w:before="40" w:after="0"/>
       </w:pPr>
     </w:p>
     <w:tbl>
@@ -993,30 +993,30 @@
     </w:p>
     <w:p>
       <w:pPr>
-        <w:spacing w:before="0" w:after="20" w:line="250" w:lineRule="exact"/>
+        <w:spacing w:line="230" w:lineRule="exact"/>
         <w:ind w:left="120" w:hanging="120"/>
       </w:pPr>
       <w:r>
         <w:rPr>
           <w:color w:val="1A1A1A"/>
-          <w:sz w:val="18"/>
-          <w:szCs w:val="18"/>
+          <w:sz w:val="17"/>
+          <w:szCs w:val="17"/>
         </w:rPr>
         <w:t xml:space="preserve">•  </w:t>
       </w:r>
       <w:r>
         <w:rPr>
           <w:color w:val="111111"/>
-          <w:sz w:val="18"/>
-          <w:szCs w:val="18"/>
+          <w:sz w:val="17"/>
+          <w:szCs w:val="17"/>
         </w:rPr>
         <w:t xml:space="preserve">Supplier Risk Management: </w:t>
       </w:r>
       <w:r>
         <w:rPr>
           <w:color w:val="1A1A1A"/>
-          <w:sz w:val="18"/>
-          <w:szCs w:val="18"/>
+          <w:sz w:val="17"/>
+          <w:szCs w:val="17"/>
         </w:rPr>
         <w:t xml:space="preserve">Built supplier risk models across 800+ global suppliers for 15+ engine lines; data-driven dual-sourcing analysis compressed average supply-disruption recovery time from 16 to 6 weeks.</w:t>
       </w:r>
@@ -1024,7 +1024,7 @@
     <w:p>
       <w:pPr>
         <w:keepNext/>
-        <w:spacing w:before="80" w:after="40"/>
+        <w:spacing w:before="60" w:after="40"/>
         <w:pBdr>
           <w:bottom w:val="single" w:sz="4" w:space="2" w:color="C5D8F0"/>
         </w:pBdr>

</xml_diff>

<commit_message>
Fix DOCX: competencies on 4 separate lines instead of one merged paragraph
Co-Authored-By: Wibey Desktop <wibey@walmart.com>
</commit_message>
<xml_diff>
--- a/resumes/Resume-AJ-2026.docx
+++ b/resumes/Resume-AJ-2026.docx
@@ -180,7 +180,7 @@
     </w:p>
     <w:p>
       <w:pPr>
-        <w:spacing w:before="0" w:after="60" w:line="230" w:lineRule="exact"/>
+        <w:spacing w:line="230" w:lineRule="exact"/>
       </w:pPr>
       <w:r>
         <w:rPr>
@@ -197,8 +197,13 @@
           <w:sz w:val="17"/>
           <w:szCs w:val="17"/>
         </w:rPr>
-        <w:t xml:space="preserve">Python · SQL · BigQuery · Git · Kinaxis    </w:t>
-      </w:r>
+        <w:t xml:space="preserve">Python · SQL · BigQuery · Git · Kinaxis</w:t>
+      </w:r>
+    </w:p>
+    <w:p>
+      <w:pPr>
+        <w:spacing w:line="230" w:lineRule="exact"/>
+      </w:pPr>
       <w:r>
         <w:rPr>
           <w:b/>
@@ -214,8 +219,13 @@
           <w:sz w:val="17"/>
           <w:szCs w:val="17"/>
         </w:rPr>
-        <w:t xml:space="preserve">Gradient Boosting Models · Time Series Forecasting · Causal Inference · Anomaly Detection · Ensemble Methods · Probabilistic Forecasting    </w:t>
-      </w:r>
+        <w:t xml:space="preserve">Gradient Boosting Models · Time Series Forecasting · Causal Inference · Anomaly Detection · Ensemble Methods · Probabilistic Forecasting</w:t>
+      </w:r>
+    </w:p>
+    <w:p>
+      <w:pPr>
+        <w:spacing w:line="230" w:lineRule="exact"/>
+      </w:pPr>
       <w:r>
         <w:rPr>
           <w:b/>
@@ -231,8 +241,13 @@
           <w:sz w:val="17"/>
           <w:szCs w:val="17"/>
         </w:rPr>
-        <w:t xml:space="preserve">S&amp;OP / IBP · NPI Launch Planning · Demand Sensing · Replenishment · Inventory Optimization · E&amp;O &amp; CTB Management    </w:t>
-      </w:r>
+        <w:t xml:space="preserve">S&amp;OP / IBP · NPI Launch Planning · Demand Sensing · Replenishment · Inventory Optimization · E&amp;O &amp; CTB Management</w:t>
+      </w:r>
+    </w:p>
+    <w:p>
+      <w:pPr>
+        <w:spacing w:before="0" w:after="60" w:line="230" w:lineRule="exact"/>
+      </w:pPr>
       <w:r>
         <w:rPr>
           <w:b/>

</xml_diff>

<commit_message>
Add phone number; condense contact to 3 lines; reduce top padding
Co-Authored-By: Wibey Desktop <wibey@walmart.com>
</commit_message>
<xml_diff>
--- a/resumes/Resume-AJ-2026.docx
+++ b/resumes/Resume-AJ-2026.docx
@@ -74,7 +74,7 @@
                 <w:sz w:val="16"/>
                 <w:szCs w:val="16"/>
               </w:rPr>
-              <w:t xml:space="preserve">astha_jain@outlook.com</w:t>
+              <w:t xml:space="preserve">860-335-7134  ·  astha_jain@outlook.com</w:t>
             </w:r>
           </w:p>
           <w:p>
@@ -88,21 +88,7 @@
                 <w:sz w:val="16"/>
                 <w:szCs w:val="16"/>
               </w:rPr>
-              <w:t xml:space="preserve">Portfolio: ajwalmart12.github.io</w:t>
-            </w:r>
-          </w:p>
-          <w:p>
-            <w:pPr>
-              <w:jc w:val="right"/>
-              <w:spacing w:line="210" w:lineRule="exact"/>
-            </w:pPr>
-            <w:r>
-              <w:rPr>
-                <w:color w:val="444444"/>
-                <w:sz w:val="16"/>
-                <w:szCs w:val="16"/>
-              </w:rPr>
-              <w:t xml:space="preserve">linkedin.com/in/asthajain12</w:t>
+              <w:t xml:space="preserve">ajwalmart12.github.io  ·  linkedin.com/in/asthajain12</w:t>
             </w:r>
           </w:p>
           <w:p>

</xml_diff>

<commit_message>
Full DOCX rebuild: sync with current HTML — EB model, all competencies, phone, bucketed portfolio
Co-Authored-By: Wibey Desktop <wibey@walmart.com>
</commit_message>
<xml_diff>
--- a/resumes/Resume-AJ-2026.docx
+++ b/resumes/Resume-AJ-2026.docx
@@ -142,7 +142,7 @@
           <w:sz w:val="18"/>
           <w:szCs w:val="18"/>
         </w:rPr>
-        <w:t xml:space="preserve">Strategic demand planning leader bridging predictive analytics, forecasting systems, and S&amp;OP execution at $1B+ scale — spanning large-scale retail (Walmart US, 5–10B monthly units across 4,593 stores), e-commerce logistics (Shopify Logistics, $1.1B GMV), and global consumer electronics (Logitech Inc., $400M portfolio). Proven across S&amp;OP governance, NPI launch execution, and cross-functional demand-to-inventory translation.</w:t>
+        <w:t xml:space="preserve">Strategic demand planning leader bridging predictive analytics, forecasting systems, and S&amp;OP execution at $1B+ scale — spanning large-scale retail (Walmart US, 5–10B monthly units across 4,593 stores), e-commerce logistics (Shopify Logistics, $1.1B GMV), and global consumer electronics (Logitech Inc., $400M portfolio, NPI hardware programs). Proven across NPI launch execution, S&amp;OP governance, and cross-functional demand-to-inventory translation in ambiguous, fast-moving environments — combining a mechanical engineering foundation (Penn State) with MIT-credentialed supply chain expertise.</w:t>
       </w:r>
     </w:p>
     <w:p>
@@ -183,7 +183,7 @@
           <w:sz w:val="17"/>
           <w:szCs w:val="17"/>
         </w:rPr>
-        <w:t xml:space="preserve">Python · SQL · BigQuery · Git · Kinaxis</w:t>
+        <w:t xml:space="preserve">Python · SQL · Excel · Power BI · BigQuery · Git · Kinaxis · AI/LLM Tools</w:t>
       </w:r>
     </w:p>
     <w:p>
@@ -205,7 +205,7 @@
           <w:sz w:val="17"/>
           <w:szCs w:val="17"/>
         </w:rPr>
-        <w:t xml:space="preserve">Gradient Boosting Models · Time Series Forecasting · Causal Inference · Anomaly Detection · Ensemble Methods · Probabilistic Forecasting</w:t>
+        <w:t xml:space="preserve">Time Series Forecasting · Causal Inference · Anomaly Detection · Ensemble Methods</w:t>
       </w:r>
     </w:p>
     <w:p>
@@ -227,7 +227,7 @@
           <w:sz w:val="17"/>
           <w:szCs w:val="17"/>
         </w:rPr>
-        <w:t xml:space="preserve">S&amp;OP / IBP · NPI Launch Planning · Demand Sensing · Replenishment · Inventory Optimization · E&amp;O &amp; CTB Management</w:t>
+        <w:t xml:space="preserve">S&amp;OP / IBP · NPI Launch Planning · Replenishment · Inventory Optimization · E&amp;O &amp; CTB Management</w:t>
       </w:r>
     </w:p>
     <w:p>
@@ -391,15 +391,15 @@
           <w:sz w:val="17"/>
           <w:szCs w:val="17"/>
         </w:rPr>
-        <w:t xml:space="preserve">Forecast Accuracy &amp; Anomaly Detection: </w:t>
-      </w:r>
-      <w:r>
-        <w:rPr>
-          <w:color w:val="1A1A1A"/>
-          <w:sz w:val="17"/>
-          <w:szCs w:val="17"/>
-        </w:rPr>
-        <w:t xml:space="preserve">Engineered a bias-correction and anomaly-detection pipeline across 5–10B monthly units (4,593 stores), triaging 50K+ weekly signals via automated ML scoring models and driving systematic forecast bias from −20% to near-neutral.</w:t>
+        <w:t xml:space="preserve">Forecast Accuracy &amp; Bias Correction: </w:t>
+      </w:r>
+      <w:r>
+        <w:rPr>
+          <w:color w:val="1A1A1A"/>
+          <w:sz w:val="17"/>
+          <w:szCs w:val="17"/>
+        </w:rPr>
+        <w:t xml:space="preserve">Developed an Empirical Bayes demand correction model to address systematic under-forecasting during government benefit cycles — operating across 16.5M store-item combinations, improving forecast accuracy by 2.03pp wMAPE, and recovering ~$254M in annualized under-forecasted demand; built AI-assisted anomaly triage pipeline triaging 50K+ weekly signals and driving systematic forecast bias from −20% to near-neutral.</w:t>
       </w:r>
     </w:p>
     <w:p>
@@ -429,7 +429,7 @@
           <w:sz w:val="17"/>
           <w:szCs w:val="17"/>
         </w:rPr>
-        <w:t xml:space="preserve">Applied causal inference to isolate the demand impact of a 970M-unit SNAP policy change across 24 states — delivering inventory positioning signals 6+ weeks ahead of policy impact windows and informing $400M+ in pre-emptive decisions.</w:t>
+        <w:t xml:space="preserve">Applied causal inference to isolate the demand impact of a 970M-unit SNAP policy change across 24 states — navigating policy uncertainty with no prior playbook, delivering inventory positioning signals 6+ weeks ahead of impact windows and informing $400M+ in pre-emptive decisions.</w:t>
       </w:r>
     </w:p>
     <w:p>
@@ -489,7 +489,7 @@
           <w:sz w:val="17"/>
           <w:szCs w:val="17"/>
         </w:rPr>
-        <w:t xml:space="preserve">Partnered with merchandising, finance, and supply chain on weekly S&amp;OP cadence; translated model outputs into actionable inventory signals for cross-functional stakeholders, compressing time-to-decision on high-priority inventory events from ~2 weeks to 3–4 days.</w:t>
+        <w:t xml:space="preserve">Owned end-to-end weekly S&amp;OP program across merchandising, finance, and supply chain; translated model outputs into actionable inventory signals and delivered executive-facing status reporting on forecast risk, compressing time-to-decision from ~2 weeks to 3–4 days.</w:t>
       </w:r>
     </w:p>
     <w:p>
@@ -655,7 +655,7 @@
           <w:sz w:val="17"/>
           <w:szCs w:val="17"/>
         </w:rPr>
-        <w:t xml:space="preserve">Designed an ML-driven demand forecasting pipeline spanning 85 warehouses and 12 carriers (~1M+ monthly orders, $1.1B GMV); automated model re-estimation cut forecast processing time by 50%, enabling near-real-time demand signal updates.</w:t>
+        <w:t xml:space="preserve">Designed an ML-driven demand forecasting pipeline spanning 85 warehouses and 12 carriers (~1M+ monthly orders, $1.1B GMV); drove capacity planning decisions across the fulfillment network; automated model re-estimation cut forecast processing time by 50%, enabling near-real-time demand signal updates.</w:t>
       </w:r>
     </w:p>
     <w:p>
@@ -859,15 +859,15 @@
           <w:sz w:val="17"/>
           <w:szCs w:val="17"/>
         </w:rPr>
-        <w:t xml:space="preserve">NPI Launch &amp; Material Readiness: </w:t>
-      </w:r>
-      <w:r>
-        <w:rPr>
-          <w:color w:val="1A1A1A"/>
-          <w:sz w:val="17"/>
-          <w:szCs w:val="17"/>
-        </w:rPr>
-        <w:t xml:space="preserve">Managed quarterly NPI launch cycles across multiple product lines with Asia-based ODM/contract manufacturing partners; led Apple Education Program tablet peripheral launch on material readiness and capacity ramp-up, accelerating delivery by 15% (~3 weeks ahead of schedule).</w:t>
+        <w:t xml:space="preserve">NPI-to-EOL Lifecycle Management: </w:t>
+      </w:r>
+      <w:r>
+        <w:rPr>
+          <w:color w:val="1A1A1A"/>
+          <w:sz w:val="17"/>
+          <w:szCs w:val="17"/>
+        </w:rPr>
+        <w:t xml:space="preserve">Managed full NPI-to-EOL lifecycle across multiple product lines on a quarterly cadence with Asia-based ODM partners; led Apple Education Program launch managing CTB readiness, material readiness, and capacity ramp-up — accelerating delivery by 15% (~3 weeks ahead of schedule).</w:t>
       </w:r>
     </w:p>
     <w:p>
@@ -1021,6 +1021,11 @@
         </w:rPr>
         <w:t xml:space="preserve">Built supplier risk models across 800+ global suppliers for 15+ engine lines; data-driven dual-sourcing analysis compressed average supply-disruption recovery time from 16 to 6 weeks.</w:t>
       </w:r>
+    </w:p>
+    <w:p>
+      <w:pPr>
+        <w:pageBreakBefore w:val="1"/>
+      </w:pPr>
     </w:p>
     <w:p>
       <w:pPr>
@@ -1201,11 +1206,6 @@
     </w:tbl>
     <w:p>
       <w:pPr>
-        <w:pageBreakBefore w:val="1"/>
-      </w:pPr>
-    </w:p>
-    <w:p>
-      <w:pPr>
         <w:keepNext/>
         <w:spacing w:before="40" w:after="40"/>
         <w:pBdr>
@@ -1223,461 +1223,94 @@
         <w:t xml:space="preserve">SELECTED WORK &amp; PORTFOLIO</w:t>
       </w:r>
     </w:p>
-    <w:tbl>
-      <w:tblPr>
-        <w:tblW w:w="9228" w:type="dxa"/>
-        <w:tblBorders>
-          <w:top w:val="none" w:sz="0" w:space="0" w:color="auto"/>
-          <w:left w:val="none" w:sz="0" w:space="0" w:color="auto"/>
-          <w:bottom w:val="none" w:sz="0" w:space="0" w:color="auto"/>
-          <w:right w:val="none" w:sz="0" w:space="0" w:color="auto"/>
-          <w:insideH w:val="none" w:sz="0" w:space="0" w:color="auto"/>
-          <w:insideV w:val="none" w:sz="0" w:space="0" w:color="auto"/>
-        </w:tblBorders>
-        <w:tblCellMar>
-          <w:top w:w="0" w:type="dxa"/>
-          <w:left w:w="0" w:type="dxa"/>
-          <w:bottom w:w="0" w:type="dxa"/>
-          <w:right w:w="0" w:type="dxa"/>
-        </w:tblCellMar>
-      </w:tblPr>
-      <w:tblGrid>
-        <w:gridCol w:w="3691"/>
-        <w:gridCol w:w="5537"/>
-      </w:tblGrid>
-      <w:tr>
-        <w:trPr>
-          <w:trH w:val="0" w:hRule="auto"/>
-        </w:trPr>
-        <w:tc>
-          <w:tcPr>
-            <w:tcW w:w="3691" w:type="dxa"/>
-          </w:tcPr>
-          <w:p>
-            <w:pPr>
-              <w:spacing w:before="0" w:after="20" w:line="230" w:lineRule="exact"/>
-            </w:pPr>
-            <w:r>
-              <w:rPr>
-                <w:b/>
-                <w:color w:val="111111"/>
-                <w:sz w:val="17"/>
-                <w:szCs w:val="17"/>
-              </w:rPr>
-              <w:t xml:space="preserve">Forecast Governance &amp; Inventory Risk</w:t>
-            </w:r>
-          </w:p>
-        </w:tc>
-        <w:tc>
-          <w:tcPr>
-            <w:tcW w:w="5537" w:type="dxa"/>
-          </w:tcPr>
-          <w:p>
-            <w:pPr>
-              <w:spacing w:before="0" w:after="20" w:line="230" w:lineRule="exact"/>
-            </w:pPr>
-            <w:r>
-              <w:rPr>
-                <w:color w:val="2A78D6"/>
-                <w:sz w:val="16"/>
-                <w:szCs w:val="16"/>
-              </w:rPr>
-              <w:t xml:space="preserve">github.com/ajwalmart12/forecast-governance</w:t>
-            </w:r>
-          </w:p>
-        </w:tc>
-      </w:tr>
-    </w:tbl>
-    <w:tbl>
-      <w:tblPr>
-        <w:tblW w:w="9228" w:type="dxa"/>
-        <w:tblBorders>
-          <w:top w:val="none" w:sz="0" w:space="0" w:color="auto"/>
-          <w:left w:val="none" w:sz="0" w:space="0" w:color="auto"/>
-          <w:bottom w:val="none" w:sz="0" w:space="0" w:color="auto"/>
-          <w:right w:val="none" w:sz="0" w:space="0" w:color="auto"/>
-          <w:insideH w:val="none" w:sz="0" w:space="0" w:color="auto"/>
-          <w:insideV w:val="none" w:sz="0" w:space="0" w:color="auto"/>
-        </w:tblBorders>
-        <w:tblCellMar>
-          <w:top w:w="0" w:type="dxa"/>
-          <w:left w:w="0" w:type="dxa"/>
-          <w:bottom w:w="0" w:type="dxa"/>
-          <w:right w:w="0" w:type="dxa"/>
-        </w:tblCellMar>
-      </w:tblPr>
-      <w:tblGrid>
-        <w:gridCol w:w="3691"/>
-        <w:gridCol w:w="5537"/>
-      </w:tblGrid>
-      <w:tr>
-        <w:trPr>
-          <w:trH w:val="0" w:hRule="auto"/>
-        </w:trPr>
-        <w:tc>
-          <w:tcPr>
-            <w:tcW w:w="3691" w:type="dxa"/>
-          </w:tcPr>
-          <w:p>
-            <w:pPr>
-              <w:spacing w:before="0" w:after="20" w:line="230" w:lineRule="exact"/>
-            </w:pPr>
-            <w:r>
-              <w:rPr>
-                <w:b/>
-                <w:color w:val="111111"/>
-                <w:sz w:val="17"/>
-                <w:szCs w:val="17"/>
-              </w:rPr>
-              <w:t xml:space="preserve">Forecast Accuracy Modeling</w:t>
-            </w:r>
-          </w:p>
-        </w:tc>
-        <w:tc>
-          <w:tcPr>
-            <w:tcW w:w="5537" w:type="dxa"/>
-          </w:tcPr>
-          <w:p>
-            <w:pPr>
-              <w:spacing w:before="0" w:after="20" w:line="230" w:lineRule="exact"/>
-            </w:pPr>
-            <w:r>
-              <w:rPr>
-                <w:color w:val="2A78D6"/>
-                <w:sz w:val="16"/>
-                <w:szCs w:val="16"/>
-              </w:rPr>
-              <w:t xml:space="preserve">github.com/ajwalmart12/forecast-accuracy</w:t>
-            </w:r>
-          </w:p>
-        </w:tc>
-      </w:tr>
-    </w:tbl>
-    <w:tbl>
-      <w:tblPr>
-        <w:tblW w:w="9228" w:type="dxa"/>
-        <w:tblBorders>
-          <w:top w:val="none" w:sz="0" w:space="0" w:color="auto"/>
-          <w:left w:val="none" w:sz="0" w:space="0" w:color="auto"/>
-          <w:bottom w:val="none" w:sz="0" w:space="0" w:color="auto"/>
-          <w:right w:val="none" w:sz="0" w:space="0" w:color="auto"/>
-          <w:insideH w:val="none" w:sz="0" w:space="0" w:color="auto"/>
-          <w:insideV w:val="none" w:sz="0" w:space="0" w:color="auto"/>
-        </w:tblBorders>
-        <w:tblCellMar>
-          <w:top w:w="0" w:type="dxa"/>
-          <w:left w:w="0" w:type="dxa"/>
-          <w:bottom w:w="0" w:type="dxa"/>
-          <w:right w:w="0" w:type="dxa"/>
-        </w:tblCellMar>
-      </w:tblPr>
-      <w:tblGrid>
-        <w:gridCol w:w="3691"/>
-        <w:gridCol w:w="5537"/>
-      </w:tblGrid>
-      <w:tr>
-        <w:trPr>
-          <w:trH w:val="0" w:hRule="auto"/>
-        </w:trPr>
-        <w:tc>
-          <w:tcPr>
-            <w:tcW w:w="3691" w:type="dxa"/>
-          </w:tcPr>
-          <w:p>
-            <w:pPr>
-              <w:spacing w:before="0" w:after="20" w:line="230" w:lineRule="exact"/>
-            </w:pPr>
-            <w:r>
-              <w:rPr>
-                <w:b/>
-                <w:color w:val="111111"/>
-                <w:sz w:val="17"/>
-                <w:szCs w:val="17"/>
-              </w:rPr>
-              <w:t xml:space="preserve">Seasonal Planning System</w:t>
-            </w:r>
-          </w:p>
-        </w:tc>
-        <w:tc>
-          <w:tcPr>
-            <w:tcW w:w="5537" w:type="dxa"/>
-          </w:tcPr>
-          <w:p>
-            <w:pPr>
-              <w:spacing w:before="0" w:after="20" w:line="230" w:lineRule="exact"/>
-            </w:pPr>
-            <w:r>
-              <w:rPr>
-                <w:color w:val="2A78D6"/>
-                <w:sz w:val="16"/>
-                <w:szCs w:val="16"/>
-              </w:rPr>
-              <w:t xml:space="preserve">github.com/ajwalmart12/seasonal-planning</w:t>
-            </w:r>
-          </w:p>
-        </w:tc>
-      </w:tr>
-    </w:tbl>
-    <w:tbl>
-      <w:tblPr>
-        <w:tblW w:w="9228" w:type="dxa"/>
-        <w:tblBorders>
-          <w:top w:val="none" w:sz="0" w:space="0" w:color="auto"/>
-          <w:left w:val="none" w:sz="0" w:space="0" w:color="auto"/>
-          <w:bottom w:val="none" w:sz="0" w:space="0" w:color="auto"/>
-          <w:right w:val="none" w:sz="0" w:space="0" w:color="auto"/>
-          <w:insideH w:val="none" w:sz="0" w:space="0" w:color="auto"/>
-          <w:insideV w:val="none" w:sz="0" w:space="0" w:color="auto"/>
-        </w:tblBorders>
-        <w:tblCellMar>
-          <w:top w:w="0" w:type="dxa"/>
-          <w:left w:w="0" w:type="dxa"/>
-          <w:bottom w:w="0" w:type="dxa"/>
-          <w:right w:w="0" w:type="dxa"/>
-        </w:tblCellMar>
-      </w:tblPr>
-      <w:tblGrid>
-        <w:gridCol w:w="3691"/>
-        <w:gridCol w:w="5537"/>
-      </w:tblGrid>
-      <w:tr>
-        <w:trPr>
-          <w:trH w:val="0" w:hRule="auto"/>
-        </w:trPr>
-        <w:tc>
-          <w:tcPr>
-            <w:tcW w:w="3691" w:type="dxa"/>
-          </w:tcPr>
-          <w:p>
-            <w:pPr>
-              <w:spacing w:before="0" w:after="20" w:line="230" w:lineRule="exact"/>
-            </w:pPr>
-            <w:r>
-              <w:rPr>
-                <w:b/>
-                <w:color w:val="111111"/>
-                <w:sz w:val="17"/>
-                <w:szCs w:val="17"/>
-              </w:rPr>
-              <w:t xml:space="preserve">Replenishment Risk Analysis</w:t>
-            </w:r>
-          </w:p>
-        </w:tc>
-        <w:tc>
-          <w:tcPr>
-            <w:tcW w:w="5537" w:type="dxa"/>
-          </w:tcPr>
-          <w:p>
-            <w:pPr>
-              <w:spacing w:before="0" w:after="20" w:line="230" w:lineRule="exact"/>
-            </w:pPr>
-            <w:r>
-              <w:rPr>
-                <w:color w:val="2A78D6"/>
-                <w:sz w:val="16"/>
-                <w:szCs w:val="16"/>
-              </w:rPr>
-              <w:t xml:space="preserve">github.com/ajwalmart12/replenishment-risk</w:t>
-            </w:r>
-          </w:p>
-        </w:tc>
-      </w:tr>
-    </w:tbl>
-    <w:tbl>
-      <w:tblPr>
-        <w:tblW w:w="9228" w:type="dxa"/>
-        <w:tblBorders>
-          <w:top w:val="none" w:sz="0" w:space="0" w:color="auto"/>
-          <w:left w:val="none" w:sz="0" w:space="0" w:color="auto"/>
-          <w:bottom w:val="none" w:sz="0" w:space="0" w:color="auto"/>
-          <w:right w:val="none" w:sz="0" w:space="0" w:color="auto"/>
-          <w:insideH w:val="none" w:sz="0" w:space="0" w:color="auto"/>
-          <w:insideV w:val="none" w:sz="0" w:space="0" w:color="auto"/>
-        </w:tblBorders>
-        <w:tblCellMar>
-          <w:top w:w="0" w:type="dxa"/>
-          <w:left w:w="0" w:type="dxa"/>
-          <w:bottom w:w="0" w:type="dxa"/>
-          <w:right w:w="0" w:type="dxa"/>
-        </w:tblCellMar>
-      </w:tblPr>
-      <w:tblGrid>
-        <w:gridCol w:w="3691"/>
-        <w:gridCol w:w="5537"/>
-      </w:tblGrid>
-      <w:tr>
-        <w:trPr>
-          <w:trH w:val="0" w:hRule="auto"/>
-        </w:trPr>
-        <w:tc>
-          <w:tcPr>
-            <w:tcW w:w="3691" w:type="dxa"/>
-          </w:tcPr>
-          <w:p>
-            <w:pPr>
-              <w:spacing w:before="0" w:after="20" w:line="230" w:lineRule="exact"/>
-            </w:pPr>
-            <w:r>
-              <w:rPr>
-                <w:b/>
-                <w:color w:val="111111"/>
-                <w:sz w:val="17"/>
-                <w:szCs w:val="17"/>
-              </w:rPr>
-              <w:t xml:space="preserve">Pricing Demand Response</w:t>
-            </w:r>
-          </w:p>
-        </w:tc>
-        <w:tc>
-          <w:tcPr>
-            <w:tcW w:w="5537" w:type="dxa"/>
-          </w:tcPr>
-          <w:p>
-            <w:pPr>
-              <w:spacing w:before="0" w:after="20" w:line="230" w:lineRule="exact"/>
-            </w:pPr>
-            <w:r>
-              <w:rPr>
-                <w:color w:val="2A78D6"/>
-                <w:sz w:val="16"/>
-                <w:szCs w:val="16"/>
-              </w:rPr>
-              <w:t xml:space="preserve">github.com/ajwalmart12/pricing-demand-response</w:t>
-            </w:r>
-          </w:p>
-        </w:tc>
-      </w:tr>
-    </w:tbl>
-    <w:tbl>
-      <w:tblPr>
-        <w:tblW w:w="9228" w:type="dxa"/>
-        <w:tblBorders>
-          <w:top w:val="none" w:sz="0" w:space="0" w:color="auto"/>
-          <w:left w:val="none" w:sz="0" w:space="0" w:color="auto"/>
-          <w:bottom w:val="none" w:sz="0" w:space="0" w:color="auto"/>
-          <w:right w:val="none" w:sz="0" w:space="0" w:color="auto"/>
-          <w:insideH w:val="none" w:sz="0" w:space="0" w:color="auto"/>
-          <w:insideV w:val="none" w:sz="0" w:space="0" w:color="auto"/>
-        </w:tblBorders>
-        <w:tblCellMar>
-          <w:top w:w="0" w:type="dxa"/>
-          <w:left w:w="0" w:type="dxa"/>
-          <w:bottom w:w="0" w:type="dxa"/>
-          <w:right w:w="0" w:type="dxa"/>
-        </w:tblCellMar>
-      </w:tblPr>
-      <w:tblGrid>
-        <w:gridCol w:w="3691"/>
-        <w:gridCol w:w="5537"/>
-      </w:tblGrid>
-      <w:tr>
-        <w:trPr>
-          <w:trH w:val="0" w:hRule="auto"/>
-        </w:trPr>
-        <w:tc>
-          <w:tcPr>
-            <w:tcW w:w="3691" w:type="dxa"/>
-          </w:tcPr>
-          <w:p>
-            <w:pPr>
-              <w:spacing w:before="0" w:after="20" w:line="230" w:lineRule="exact"/>
-            </w:pPr>
-            <w:r>
-              <w:rPr>
-                <w:b/>
-                <w:color w:val="111111"/>
-                <w:sz w:val="17"/>
-                <w:szCs w:val="17"/>
-              </w:rPr>
-              <w:t xml:space="preserve">Transportation Demand Forecasting</w:t>
-            </w:r>
-          </w:p>
-        </w:tc>
-        <w:tc>
-          <w:tcPr>
-            <w:tcW w:w="5537" w:type="dxa"/>
-          </w:tcPr>
-          <w:p>
-            <w:pPr>
-              <w:spacing w:before="0" w:after="20" w:line="230" w:lineRule="exact"/>
-            </w:pPr>
-            <w:r>
-              <w:rPr>
-                <w:color w:val="2A78D6"/>
-                <w:sz w:val="16"/>
-                <w:szCs w:val="16"/>
-              </w:rPr>
-              <w:t xml:space="preserve">github.com/ajwalmart12/shopify-demand-forecasting</w:t>
-            </w:r>
-          </w:p>
-        </w:tc>
-      </w:tr>
-    </w:tbl>
-    <w:tbl>
-      <w:tblPr>
-        <w:tblW w:w="9228" w:type="dxa"/>
-        <w:tblBorders>
-          <w:top w:val="none" w:sz="0" w:space="0" w:color="auto"/>
-          <w:left w:val="none" w:sz="0" w:space="0" w:color="auto"/>
-          <w:bottom w:val="none" w:sz="0" w:space="0" w:color="auto"/>
-          <w:right w:val="none" w:sz="0" w:space="0" w:color="auto"/>
-          <w:insideH w:val="none" w:sz="0" w:space="0" w:color="auto"/>
-          <w:insideV w:val="none" w:sz="0" w:space="0" w:color="auto"/>
-        </w:tblBorders>
-        <w:tblCellMar>
-          <w:top w:w="0" w:type="dxa"/>
-          <w:left w:w="0" w:type="dxa"/>
-          <w:bottom w:w="0" w:type="dxa"/>
-          <w:right w:w="0" w:type="dxa"/>
-        </w:tblCellMar>
-      </w:tblPr>
-      <w:tblGrid>
-        <w:gridCol w:w="3691"/>
-        <w:gridCol w:w="5537"/>
-      </w:tblGrid>
-      <w:tr>
-        <w:trPr>
-          <w:trH w:val="0" w:hRule="auto"/>
-        </w:trPr>
-        <w:tc>
-          <w:tcPr>
-            <w:tcW w:w="3691" w:type="dxa"/>
-          </w:tcPr>
-          <w:p>
-            <w:pPr>
-              <w:spacing w:before="0" w:after="20" w:line="230" w:lineRule="exact"/>
-            </w:pPr>
-            <w:r>
-              <w:rPr>
-                <w:b/>
-                <w:color w:val="111111"/>
-                <w:sz w:val="17"/>
-                <w:szCs w:val="17"/>
-              </w:rPr>
-              <w:t xml:space="preserve">Global Supply Planning</w:t>
-            </w:r>
-          </w:p>
-        </w:tc>
-        <w:tc>
-          <w:tcPr>
-            <w:tcW w:w="5537" w:type="dxa"/>
-          </w:tcPr>
-          <w:p>
-            <w:pPr>
-              <w:spacing w:before="0" w:after="20" w:line="230" w:lineRule="exact"/>
-            </w:pPr>
-            <w:r>
-              <w:rPr>
-                <w:color w:val="2A78D6"/>
-                <w:sz w:val="16"/>
-                <w:szCs w:val="16"/>
-              </w:rPr>
-              <w:t xml:space="preserve">github.com/ajwalmart12/logitech-supply-planning</w:t>
-            </w:r>
-          </w:p>
-        </w:tc>
-      </w:tr>
-    </w:tbl>
+    <w:p>
+      <w:pPr>
+        <w:spacing w:before="0" w:after="20" w:line="230" w:lineRule="exact"/>
+      </w:pPr>
+      <w:r>
+        <w:rPr>
+          <w:b/>
+          <w:color w:val="111111"/>
+          <w:sz w:val="17"/>
+          <w:szCs w:val="17"/>
+        </w:rPr>
+        <w:t xml:space="preserve">Forecasting &amp; Accuracy: </w:t>
+      </w:r>
+      <w:r>
+        <w:rPr>
+          <w:color w:val="444444"/>
+          <w:sz w:val="16"/>
+          <w:szCs w:val="16"/>
+        </w:rPr>
+        <w:t xml:space="preserve">Forecast Governance &amp; Inventory Risk  ·  Forecast Accuracy Modeling  ·  Seasonal Planning System</w:t>
+      </w:r>
+    </w:p>
+    <w:p>
+      <w:pPr>
+        <w:spacing w:before="0" w:after="20" w:line="230" w:lineRule="exact"/>
+      </w:pPr>
+      <w:r>
+        <w:rPr>
+          <w:b/>
+          <w:color w:val="111111"/>
+          <w:sz w:val="17"/>
+          <w:szCs w:val="17"/>
+        </w:rPr>
+        <w:t xml:space="preserve">Inventory &amp; Supply Planning: </w:t>
+      </w:r>
+      <w:r>
+        <w:rPr>
+          <w:color w:val="444444"/>
+          <w:sz w:val="16"/>
+          <w:szCs w:val="16"/>
+        </w:rPr>
+        <w:t xml:space="preserve">Replenishment Risk Analysis  ·  Global Supply Planning  ·  NPI Launch Planning</w:t>
+      </w:r>
+    </w:p>
+    <w:p>
+      <w:pPr>
+        <w:spacing w:before="0" w:after="20" w:line="230" w:lineRule="exact"/>
+      </w:pPr>
+      <w:r>
+        <w:rPr>
+          <w:b/>
+          <w:color w:val="111111"/>
+          <w:sz w:val="17"/>
+          <w:szCs w:val="17"/>
+        </w:rPr>
+        <w:t xml:space="preserve">Network &amp; Transportation: </w:t>
+      </w:r>
+      <w:r>
+        <w:rPr>
+          <w:color w:val="444444"/>
+          <w:sz w:val="16"/>
+          <w:szCs w:val="16"/>
+        </w:rPr>
+        <w:t xml:space="preserve">Transportation Demand Forecasting</w:t>
+      </w:r>
+    </w:p>
+    <w:p>
+      <w:pPr>
+        <w:spacing w:before="0" w:after="20" w:line="230" w:lineRule="exact"/>
+      </w:pPr>
+      <w:r>
+        <w:rPr>
+          <w:b/>
+          <w:color w:val="111111"/>
+          <w:sz w:val="17"/>
+          <w:szCs w:val="17"/>
+        </w:rPr>
+        <w:t xml:space="preserve">Pricing &amp; Demand Response: </w:t>
+      </w:r>
+      <w:r>
+        <w:rPr>
+          <w:color w:val="444444"/>
+          <w:sz w:val="16"/>
+          <w:szCs w:val="16"/>
+        </w:rPr>
+        <w:t xml:space="preserve">Pricing Demand Response</w:t>
+      </w:r>
+    </w:p>
     <w:sectPr>
       <w:pgSz w:w="12240" w:h="15840"/>
       <w:pgMar w:top="604" w:right="720" w:bottom="547" w:left="835" w:header="0" w:footer="0" w:gutter="0"/>

</xml_diff>

<commit_message>
Remove forced page break from DOCX — fixes Cummins orphan/blank page issue
Co-Authored-By: Wibey Desktop <wibey@walmart.com>
</commit_message>
<xml_diff>
--- a/resumes/Resume-AJ-2026.docx
+++ b/resumes/Resume-AJ-2026.docx
@@ -1021,11 +1021,6 @@
         </w:rPr>
         <w:t xml:space="preserve">Built supplier risk models across 800+ global suppliers for 15+ engine lines; data-driven dual-sourcing analysis compressed average supply-disruption recovery time from 16 to 6 weeks.</w:t>
       </w:r>
-    </w:p>
-    <w:p>
-      <w:pPr>
-        <w:pageBreakBefore w:val="1"/>
-      </w:pPr>
     </w:p>
     <w:p>
       <w:pPr>

</xml_diff>

<commit_message>
Restore GitHub URLs in DOCX Selected Work — bucketed with name left, URL right
Co-Authored-By: Wibey Desktop <wibey@walmart.com>
</commit_message>
<xml_diff>
--- a/resumes/Resume-AJ-2026.docx
+++ b/resumes/Resume-AJ-2026.docx
@@ -1220,92 +1220,580 @@
     </w:p>
     <w:p>
       <w:pPr>
-        <w:spacing w:before="0" w:after="20" w:line="230" w:lineRule="exact"/>
+        <w:spacing w:before="20" w:after="0" w:line="220" w:lineRule="exact"/>
       </w:pPr>
       <w:r>
         <w:rPr>
           <w:b/>
-          <w:color w:val="111111"/>
-          <w:sz w:val="17"/>
-          <w:szCs w:val="17"/>
-        </w:rPr>
-        <w:t xml:space="preserve">Forecasting &amp; Accuracy: </w:t>
-      </w:r>
-      <w:r>
-        <w:rPr>
-          <w:color w:val="444444"/>
-          <w:sz w:val="16"/>
-          <w:szCs w:val="16"/>
-        </w:rPr>
-        <w:t xml:space="preserve">Forecast Governance &amp; Inventory Risk  ·  Forecast Accuracy Modeling  ·  Seasonal Planning System</w:t>
-      </w:r>
-    </w:p>
-    <w:p>
-      <w:pPr>
-        <w:spacing w:before="0" w:after="20" w:line="230" w:lineRule="exact"/>
+          <w:color w:val="2A78D6"/>
+          <w:sz w:val="17"/>
+          <w:szCs w:val="17"/>
+        </w:rPr>
+        <w:t xml:space="preserve">Forecasting &amp; Accuracy:</w:t>
+      </w:r>
+    </w:p>
+    <w:tbl>
+      <w:tblPr>
+        <w:tblW w:w="9228" w:type="dxa"/>
+        <w:tblBorders>
+          <w:top w:val="none" w:sz="0" w:space="0" w:color="auto"/>
+          <w:left w:val="none" w:sz="0" w:space="0" w:color="auto"/>
+          <w:bottom w:val="none" w:sz="0" w:space="0" w:color="auto"/>
+          <w:right w:val="none" w:sz="0" w:space="0" w:color="auto"/>
+          <w:insideH w:val="none" w:sz="0" w:space="0" w:color="auto"/>
+          <w:insideV w:val="none" w:sz="0" w:space="0" w:color="auto"/>
+        </w:tblBorders>
+        <w:tblCellMar>
+          <w:top w:w="0" w:type="dxa"/>
+          <w:left w:w="0" w:type="dxa"/>
+          <w:bottom w:w="0" w:type="dxa"/>
+          <w:right w:w="0" w:type="dxa"/>
+        </w:tblCellMar>
+      </w:tblPr>
+      <w:tblGrid>
+        <w:gridCol w:w="3875"/>
+        <w:gridCol w:w="5353"/>
+      </w:tblGrid>
+      <w:tr>
+        <w:trPr>
+          <w:trH w:val="0" w:hRule="auto"/>
+        </w:trPr>
+        <w:tc>
+          <w:tcPr>
+            <w:tcW w:w="3875" w:type="dxa"/>
+          </w:tcPr>
+          <w:p>
+            <w:pPr>
+              <w:spacing w:line="220" w:lineRule="exact"/>
+            </w:pPr>
+            <w:r>
+              <w:rPr>
+                <w:color w:val="111111"/>
+                <w:sz w:val="16"/>
+                <w:szCs w:val="16"/>
+              </w:rPr>
+              <w:t xml:space="preserve">Forecast Governance &amp; Inventory Risk</w:t>
+            </w:r>
+          </w:p>
+        </w:tc>
+        <w:tc>
+          <w:tcPr>
+            <w:tcW w:w="5353" w:type="dxa"/>
+          </w:tcPr>
+          <w:p>
+            <w:pPr>
+              <w:jc w:val="right"/>
+              <w:spacing w:line="220" w:lineRule="exact"/>
+            </w:pPr>
+            <w:r>
+              <w:rPr>
+                <w:color w:val="444444"/>
+                <w:sz w:val="15"/>
+                <w:szCs w:val="15"/>
+              </w:rPr>
+              <w:t xml:space="preserve">github.com/ajwalmart12/forecast-governance</w:t>
+            </w:r>
+          </w:p>
+        </w:tc>
+      </w:tr>
+    </w:tbl>
+    <w:tbl>
+      <w:tblPr>
+        <w:tblW w:w="9228" w:type="dxa"/>
+        <w:tblBorders>
+          <w:top w:val="none" w:sz="0" w:space="0" w:color="auto"/>
+          <w:left w:val="none" w:sz="0" w:space="0" w:color="auto"/>
+          <w:bottom w:val="none" w:sz="0" w:space="0" w:color="auto"/>
+          <w:right w:val="none" w:sz="0" w:space="0" w:color="auto"/>
+          <w:insideH w:val="none" w:sz="0" w:space="0" w:color="auto"/>
+          <w:insideV w:val="none" w:sz="0" w:space="0" w:color="auto"/>
+        </w:tblBorders>
+        <w:tblCellMar>
+          <w:top w:w="0" w:type="dxa"/>
+          <w:left w:w="0" w:type="dxa"/>
+          <w:bottom w:w="0" w:type="dxa"/>
+          <w:right w:w="0" w:type="dxa"/>
+        </w:tblCellMar>
+      </w:tblPr>
+      <w:tblGrid>
+        <w:gridCol w:w="3875"/>
+        <w:gridCol w:w="5353"/>
+      </w:tblGrid>
+      <w:tr>
+        <w:trPr>
+          <w:trH w:val="0" w:hRule="auto"/>
+        </w:trPr>
+        <w:tc>
+          <w:tcPr>
+            <w:tcW w:w="3875" w:type="dxa"/>
+          </w:tcPr>
+          <w:p>
+            <w:pPr>
+              <w:spacing w:line="220" w:lineRule="exact"/>
+            </w:pPr>
+            <w:r>
+              <w:rPr>
+                <w:color w:val="111111"/>
+                <w:sz w:val="16"/>
+                <w:szCs w:val="16"/>
+              </w:rPr>
+              <w:t xml:space="preserve">Forecast Accuracy Modeling</w:t>
+            </w:r>
+          </w:p>
+        </w:tc>
+        <w:tc>
+          <w:tcPr>
+            <w:tcW w:w="5353" w:type="dxa"/>
+          </w:tcPr>
+          <w:p>
+            <w:pPr>
+              <w:jc w:val="right"/>
+              <w:spacing w:line="220" w:lineRule="exact"/>
+            </w:pPr>
+            <w:r>
+              <w:rPr>
+                <w:color w:val="444444"/>
+                <w:sz w:val="15"/>
+                <w:szCs w:val="15"/>
+              </w:rPr>
+              <w:t xml:space="preserve">github.com/ajwalmart12/forecast-accuracy</w:t>
+            </w:r>
+          </w:p>
+        </w:tc>
+      </w:tr>
+    </w:tbl>
+    <w:tbl>
+      <w:tblPr>
+        <w:tblW w:w="9228" w:type="dxa"/>
+        <w:tblBorders>
+          <w:top w:val="none" w:sz="0" w:space="0" w:color="auto"/>
+          <w:left w:val="none" w:sz="0" w:space="0" w:color="auto"/>
+          <w:bottom w:val="none" w:sz="0" w:space="0" w:color="auto"/>
+          <w:right w:val="none" w:sz="0" w:space="0" w:color="auto"/>
+          <w:insideH w:val="none" w:sz="0" w:space="0" w:color="auto"/>
+          <w:insideV w:val="none" w:sz="0" w:space="0" w:color="auto"/>
+        </w:tblBorders>
+        <w:tblCellMar>
+          <w:top w:w="0" w:type="dxa"/>
+          <w:left w:w="0" w:type="dxa"/>
+          <w:bottom w:w="0" w:type="dxa"/>
+          <w:right w:w="0" w:type="dxa"/>
+        </w:tblCellMar>
+      </w:tblPr>
+      <w:tblGrid>
+        <w:gridCol w:w="3875"/>
+        <w:gridCol w:w="5353"/>
+      </w:tblGrid>
+      <w:tr>
+        <w:trPr>
+          <w:trH w:val="0" w:hRule="auto"/>
+        </w:trPr>
+        <w:tc>
+          <w:tcPr>
+            <w:tcW w:w="3875" w:type="dxa"/>
+          </w:tcPr>
+          <w:p>
+            <w:pPr>
+              <w:spacing w:line="220" w:lineRule="exact"/>
+            </w:pPr>
+            <w:r>
+              <w:rPr>
+                <w:color w:val="111111"/>
+                <w:sz w:val="16"/>
+                <w:szCs w:val="16"/>
+              </w:rPr>
+              <w:t xml:space="preserve">Seasonal Planning System</w:t>
+            </w:r>
+          </w:p>
+        </w:tc>
+        <w:tc>
+          <w:tcPr>
+            <w:tcW w:w="5353" w:type="dxa"/>
+          </w:tcPr>
+          <w:p>
+            <w:pPr>
+              <w:jc w:val="right"/>
+              <w:spacing w:line="220" w:lineRule="exact"/>
+            </w:pPr>
+            <w:r>
+              <w:rPr>
+                <w:color w:val="444444"/>
+                <w:sz w:val="15"/>
+                <w:szCs w:val="15"/>
+              </w:rPr>
+              <w:t xml:space="preserve">github.com/ajwalmart12/seasonal-planning</w:t>
+            </w:r>
+          </w:p>
+        </w:tc>
+      </w:tr>
+    </w:tbl>
+    <w:p>
+      <w:pPr>
+        <w:spacing w:before="20" w:after="0" w:line="220" w:lineRule="exact"/>
       </w:pPr>
       <w:r>
         <w:rPr>
           <w:b/>
-          <w:color w:val="111111"/>
-          <w:sz w:val="17"/>
-          <w:szCs w:val="17"/>
-        </w:rPr>
-        <w:t xml:space="preserve">Inventory &amp; Supply Planning: </w:t>
-      </w:r>
-      <w:r>
-        <w:rPr>
-          <w:color w:val="444444"/>
-          <w:sz w:val="16"/>
-          <w:szCs w:val="16"/>
-        </w:rPr>
-        <w:t xml:space="preserve">Replenishment Risk Analysis  ·  Global Supply Planning  ·  NPI Launch Planning</w:t>
-      </w:r>
-    </w:p>
-    <w:p>
-      <w:pPr>
-        <w:spacing w:before="0" w:after="20" w:line="230" w:lineRule="exact"/>
+          <w:color w:val="2A78D6"/>
+          <w:sz w:val="17"/>
+          <w:szCs w:val="17"/>
+        </w:rPr>
+        <w:t xml:space="preserve">Inventory &amp; Supply Planning:</w:t>
+      </w:r>
+    </w:p>
+    <w:tbl>
+      <w:tblPr>
+        <w:tblW w:w="9228" w:type="dxa"/>
+        <w:tblBorders>
+          <w:top w:val="none" w:sz="0" w:space="0" w:color="auto"/>
+          <w:left w:val="none" w:sz="0" w:space="0" w:color="auto"/>
+          <w:bottom w:val="none" w:sz="0" w:space="0" w:color="auto"/>
+          <w:right w:val="none" w:sz="0" w:space="0" w:color="auto"/>
+          <w:insideH w:val="none" w:sz="0" w:space="0" w:color="auto"/>
+          <w:insideV w:val="none" w:sz="0" w:space="0" w:color="auto"/>
+        </w:tblBorders>
+        <w:tblCellMar>
+          <w:top w:w="0" w:type="dxa"/>
+          <w:left w:w="0" w:type="dxa"/>
+          <w:bottom w:w="0" w:type="dxa"/>
+          <w:right w:w="0" w:type="dxa"/>
+        </w:tblCellMar>
+      </w:tblPr>
+      <w:tblGrid>
+        <w:gridCol w:w="3875"/>
+        <w:gridCol w:w="5353"/>
+      </w:tblGrid>
+      <w:tr>
+        <w:trPr>
+          <w:trH w:val="0" w:hRule="auto"/>
+        </w:trPr>
+        <w:tc>
+          <w:tcPr>
+            <w:tcW w:w="3875" w:type="dxa"/>
+          </w:tcPr>
+          <w:p>
+            <w:pPr>
+              <w:spacing w:line="220" w:lineRule="exact"/>
+            </w:pPr>
+            <w:r>
+              <w:rPr>
+                <w:color w:val="111111"/>
+                <w:sz w:val="16"/>
+                <w:szCs w:val="16"/>
+              </w:rPr>
+              <w:t xml:space="preserve">Replenishment Risk Analysis</w:t>
+            </w:r>
+          </w:p>
+        </w:tc>
+        <w:tc>
+          <w:tcPr>
+            <w:tcW w:w="5353" w:type="dxa"/>
+          </w:tcPr>
+          <w:p>
+            <w:pPr>
+              <w:jc w:val="right"/>
+              <w:spacing w:line="220" w:lineRule="exact"/>
+            </w:pPr>
+            <w:r>
+              <w:rPr>
+                <w:color w:val="444444"/>
+                <w:sz w:val="15"/>
+                <w:szCs w:val="15"/>
+              </w:rPr>
+              <w:t xml:space="preserve">github.com/ajwalmart12/replenishment-risk</w:t>
+            </w:r>
+          </w:p>
+        </w:tc>
+      </w:tr>
+    </w:tbl>
+    <w:tbl>
+      <w:tblPr>
+        <w:tblW w:w="9228" w:type="dxa"/>
+        <w:tblBorders>
+          <w:top w:val="none" w:sz="0" w:space="0" w:color="auto"/>
+          <w:left w:val="none" w:sz="0" w:space="0" w:color="auto"/>
+          <w:bottom w:val="none" w:sz="0" w:space="0" w:color="auto"/>
+          <w:right w:val="none" w:sz="0" w:space="0" w:color="auto"/>
+          <w:insideH w:val="none" w:sz="0" w:space="0" w:color="auto"/>
+          <w:insideV w:val="none" w:sz="0" w:space="0" w:color="auto"/>
+        </w:tblBorders>
+        <w:tblCellMar>
+          <w:top w:w="0" w:type="dxa"/>
+          <w:left w:w="0" w:type="dxa"/>
+          <w:bottom w:w="0" w:type="dxa"/>
+          <w:right w:w="0" w:type="dxa"/>
+        </w:tblCellMar>
+      </w:tblPr>
+      <w:tblGrid>
+        <w:gridCol w:w="3875"/>
+        <w:gridCol w:w="5353"/>
+      </w:tblGrid>
+      <w:tr>
+        <w:trPr>
+          <w:trH w:val="0" w:hRule="auto"/>
+        </w:trPr>
+        <w:tc>
+          <w:tcPr>
+            <w:tcW w:w="3875" w:type="dxa"/>
+          </w:tcPr>
+          <w:p>
+            <w:pPr>
+              <w:spacing w:line="220" w:lineRule="exact"/>
+            </w:pPr>
+            <w:r>
+              <w:rPr>
+                <w:color w:val="111111"/>
+                <w:sz w:val="16"/>
+                <w:szCs w:val="16"/>
+              </w:rPr>
+              <w:t xml:space="preserve">Global Supply Planning</w:t>
+            </w:r>
+          </w:p>
+        </w:tc>
+        <w:tc>
+          <w:tcPr>
+            <w:tcW w:w="5353" w:type="dxa"/>
+          </w:tcPr>
+          <w:p>
+            <w:pPr>
+              <w:jc w:val="right"/>
+              <w:spacing w:line="220" w:lineRule="exact"/>
+            </w:pPr>
+            <w:r>
+              <w:rPr>
+                <w:color w:val="444444"/>
+                <w:sz w:val="15"/>
+                <w:szCs w:val="15"/>
+              </w:rPr>
+              <w:t xml:space="preserve">github.com/ajwalmart12/logitech-supply-planning</w:t>
+            </w:r>
+          </w:p>
+        </w:tc>
+      </w:tr>
+    </w:tbl>
+    <w:tbl>
+      <w:tblPr>
+        <w:tblW w:w="9228" w:type="dxa"/>
+        <w:tblBorders>
+          <w:top w:val="none" w:sz="0" w:space="0" w:color="auto"/>
+          <w:left w:val="none" w:sz="0" w:space="0" w:color="auto"/>
+          <w:bottom w:val="none" w:sz="0" w:space="0" w:color="auto"/>
+          <w:right w:val="none" w:sz="0" w:space="0" w:color="auto"/>
+          <w:insideH w:val="none" w:sz="0" w:space="0" w:color="auto"/>
+          <w:insideV w:val="none" w:sz="0" w:space="0" w:color="auto"/>
+        </w:tblBorders>
+        <w:tblCellMar>
+          <w:top w:w="0" w:type="dxa"/>
+          <w:left w:w="0" w:type="dxa"/>
+          <w:bottom w:w="0" w:type="dxa"/>
+          <w:right w:w="0" w:type="dxa"/>
+        </w:tblCellMar>
+      </w:tblPr>
+      <w:tblGrid>
+        <w:gridCol w:w="3875"/>
+        <w:gridCol w:w="5353"/>
+      </w:tblGrid>
+      <w:tr>
+        <w:trPr>
+          <w:trH w:val="0" w:hRule="auto"/>
+        </w:trPr>
+        <w:tc>
+          <w:tcPr>
+            <w:tcW w:w="3875" w:type="dxa"/>
+          </w:tcPr>
+          <w:p>
+            <w:pPr>
+              <w:spacing w:line="220" w:lineRule="exact"/>
+            </w:pPr>
+            <w:r>
+              <w:rPr>
+                <w:color w:val="111111"/>
+                <w:sz w:val="16"/>
+                <w:szCs w:val="16"/>
+              </w:rPr>
+              <w:t xml:space="preserve">NPI Launch Planning</w:t>
+            </w:r>
+          </w:p>
+        </w:tc>
+        <w:tc>
+          <w:tcPr>
+            <w:tcW w:w="5353" w:type="dxa"/>
+          </w:tcPr>
+          <w:p>
+            <w:pPr>
+              <w:jc w:val="right"/>
+              <w:spacing w:line="220" w:lineRule="exact"/>
+            </w:pPr>
+            <w:r>
+              <w:rPr>
+                <w:color w:val="444444"/>
+                <w:sz w:val="15"/>
+                <w:szCs w:val="15"/>
+              </w:rPr>
+              <w:t xml:space="preserve">github.com/ajwalmart12/npi-launch-planning</w:t>
+            </w:r>
+          </w:p>
+        </w:tc>
+      </w:tr>
+    </w:tbl>
+    <w:p>
+      <w:pPr>
+        <w:spacing w:before="20" w:after="0" w:line="220" w:lineRule="exact"/>
       </w:pPr>
       <w:r>
         <w:rPr>
           <w:b/>
-          <w:color w:val="111111"/>
-          <w:sz w:val="17"/>
-          <w:szCs w:val="17"/>
-        </w:rPr>
-        <w:t xml:space="preserve">Network &amp; Transportation: </w:t>
-      </w:r>
-      <w:r>
-        <w:rPr>
-          <w:color w:val="444444"/>
-          <w:sz w:val="16"/>
-          <w:szCs w:val="16"/>
-        </w:rPr>
-        <w:t xml:space="preserve">Transportation Demand Forecasting</w:t>
-      </w:r>
-    </w:p>
-    <w:p>
-      <w:pPr>
-        <w:spacing w:before="0" w:after="20" w:line="230" w:lineRule="exact"/>
+          <w:color w:val="2A78D6"/>
+          <w:sz w:val="17"/>
+          <w:szCs w:val="17"/>
+        </w:rPr>
+        <w:t xml:space="preserve">Network &amp; Transportation:</w:t>
+      </w:r>
+    </w:p>
+    <w:tbl>
+      <w:tblPr>
+        <w:tblW w:w="9228" w:type="dxa"/>
+        <w:tblBorders>
+          <w:top w:val="none" w:sz="0" w:space="0" w:color="auto"/>
+          <w:left w:val="none" w:sz="0" w:space="0" w:color="auto"/>
+          <w:bottom w:val="none" w:sz="0" w:space="0" w:color="auto"/>
+          <w:right w:val="none" w:sz="0" w:space="0" w:color="auto"/>
+          <w:insideH w:val="none" w:sz="0" w:space="0" w:color="auto"/>
+          <w:insideV w:val="none" w:sz="0" w:space="0" w:color="auto"/>
+        </w:tblBorders>
+        <w:tblCellMar>
+          <w:top w:w="0" w:type="dxa"/>
+          <w:left w:w="0" w:type="dxa"/>
+          <w:bottom w:w="0" w:type="dxa"/>
+          <w:right w:w="0" w:type="dxa"/>
+        </w:tblCellMar>
+      </w:tblPr>
+      <w:tblGrid>
+        <w:gridCol w:w="3875"/>
+        <w:gridCol w:w="5353"/>
+      </w:tblGrid>
+      <w:tr>
+        <w:trPr>
+          <w:trH w:val="0" w:hRule="auto"/>
+        </w:trPr>
+        <w:tc>
+          <w:tcPr>
+            <w:tcW w:w="3875" w:type="dxa"/>
+          </w:tcPr>
+          <w:p>
+            <w:pPr>
+              <w:spacing w:line="220" w:lineRule="exact"/>
+            </w:pPr>
+            <w:r>
+              <w:rPr>
+                <w:color w:val="111111"/>
+                <w:sz w:val="16"/>
+                <w:szCs w:val="16"/>
+              </w:rPr>
+              <w:t xml:space="preserve">Transportation Demand Forecasting</w:t>
+            </w:r>
+          </w:p>
+        </w:tc>
+        <w:tc>
+          <w:tcPr>
+            <w:tcW w:w="5353" w:type="dxa"/>
+          </w:tcPr>
+          <w:p>
+            <w:pPr>
+              <w:jc w:val="right"/>
+              <w:spacing w:line="220" w:lineRule="exact"/>
+            </w:pPr>
+            <w:r>
+              <w:rPr>
+                <w:color w:val="444444"/>
+                <w:sz w:val="15"/>
+                <w:szCs w:val="15"/>
+              </w:rPr>
+              <w:t xml:space="preserve">github.com/ajwalmart12/shopify-demand-forecasting</w:t>
+            </w:r>
+          </w:p>
+        </w:tc>
+      </w:tr>
+    </w:tbl>
+    <w:p>
+      <w:pPr>
+        <w:spacing w:before="20" w:after="0" w:line="220" w:lineRule="exact"/>
       </w:pPr>
       <w:r>
         <w:rPr>
           <w:b/>
-          <w:color w:val="111111"/>
-          <w:sz w:val="17"/>
-          <w:szCs w:val="17"/>
-        </w:rPr>
-        <w:t xml:space="preserve">Pricing &amp; Demand Response: </w:t>
-      </w:r>
-      <w:r>
-        <w:rPr>
-          <w:color w:val="444444"/>
-          <w:sz w:val="16"/>
-          <w:szCs w:val="16"/>
-        </w:rPr>
-        <w:t xml:space="preserve">Pricing Demand Response</w:t>
-      </w:r>
-    </w:p>
+          <w:color w:val="2A78D6"/>
+          <w:sz w:val="17"/>
+          <w:szCs w:val="17"/>
+        </w:rPr>
+        <w:t xml:space="preserve">Pricing &amp; Demand Response:</w:t>
+      </w:r>
+    </w:p>
+    <w:tbl>
+      <w:tblPr>
+        <w:tblW w:w="9228" w:type="dxa"/>
+        <w:tblBorders>
+          <w:top w:val="none" w:sz="0" w:space="0" w:color="auto"/>
+          <w:left w:val="none" w:sz="0" w:space="0" w:color="auto"/>
+          <w:bottom w:val="none" w:sz="0" w:space="0" w:color="auto"/>
+          <w:right w:val="none" w:sz="0" w:space="0" w:color="auto"/>
+          <w:insideH w:val="none" w:sz="0" w:space="0" w:color="auto"/>
+          <w:insideV w:val="none" w:sz="0" w:space="0" w:color="auto"/>
+        </w:tblBorders>
+        <w:tblCellMar>
+          <w:top w:w="0" w:type="dxa"/>
+          <w:left w:w="0" w:type="dxa"/>
+          <w:bottom w:w="0" w:type="dxa"/>
+          <w:right w:w="0" w:type="dxa"/>
+        </w:tblCellMar>
+      </w:tblPr>
+      <w:tblGrid>
+        <w:gridCol w:w="3875"/>
+        <w:gridCol w:w="5353"/>
+      </w:tblGrid>
+      <w:tr>
+        <w:trPr>
+          <w:trH w:val="0" w:hRule="auto"/>
+        </w:trPr>
+        <w:tc>
+          <w:tcPr>
+            <w:tcW w:w="3875" w:type="dxa"/>
+          </w:tcPr>
+          <w:p>
+            <w:pPr>
+              <w:spacing w:line="220" w:lineRule="exact"/>
+            </w:pPr>
+            <w:r>
+              <w:rPr>
+                <w:color w:val="111111"/>
+                <w:sz w:val="16"/>
+                <w:szCs w:val="16"/>
+              </w:rPr>
+              <w:t xml:space="preserve">Pricing Demand Response</w:t>
+            </w:r>
+          </w:p>
+        </w:tc>
+        <w:tc>
+          <w:tcPr>
+            <w:tcW w:w="5353" w:type="dxa"/>
+          </w:tcPr>
+          <w:p>
+            <w:pPr>
+              <w:jc w:val="right"/>
+              <w:spacing w:line="220" w:lineRule="exact"/>
+            </w:pPr>
+            <w:r>
+              <w:rPr>
+                <w:color w:val="444444"/>
+                <w:sz w:val="15"/>
+                <w:szCs w:val="15"/>
+              </w:rPr>
+              <w:t xml:space="preserve">github.com/ajwalmart12/pricing-demand-response</w:t>
+            </w:r>
+          </w:p>
+        </w:tc>
+      </w:tr>
+    </w:tbl>
     <w:sectPr>
       <w:pgSz w:w="12240" w:h="15840"/>
       <w:pgMar w:top="604" w:right="720" w:bottom="547" w:left="835" w:header="0" w:footer="0" w:gutter="0"/>

</xml_diff>

<commit_message>
Fix DOCX header: remove small_caps (was causing LEADER underline), vertically center contact
Co-Authored-By: Wibey Desktop <wibey@walmart.com>
</commit_message>
<xml_diff>
--- a/resumes/Resume-AJ-2026.docx
+++ b/resumes/Resume-AJ-2026.docx
@@ -50,18 +50,18 @@
             <w:r>
               <w:rPr>
                 <w:b/>
-                <w:smallCaps/>
                 <w:color w:val="2A78D6"/>
                 <w:sz w:val="14"/>
                 <w:szCs w:val="14"/>
               </w:rPr>
-              <w:t xml:space="preserve">Demand Planning Leader  ·  Data Science &amp; Supply Chain</w:t>
+              <w:t xml:space="preserve">DEMAND PLANNING LEADER  ·  DATA SCIENCE &amp; SUPPLY CHAIN</w:t>
             </w:r>
           </w:p>
         </w:tc>
         <w:tc>
           <w:tcPr>
             <w:tcW w:w="3507" w:type="dxa"/>
+            <w:vAlign w:val="center"/>
           </w:tcPr>
           <w:p>
             <w:pPr>

</xml_diff>

<commit_message>
Role-specific summaries + competencies; small-caps bullet headers; sync all 6 variants
Co-Authored-By: Wibey Desktop <wibey@walmart.com>
</commit_message>
<xml_diff>
--- a/resumes/Resume-AJ-2026.docx
+++ b/resumes/Resume-AJ-2026.docx
@@ -88,7 +88,7 @@
                 <w:sz w:val="16"/>
                 <w:szCs w:val="16"/>
               </w:rPr>
-              <w:t xml:space="preserve">ajwalmart12.github.io  ·  linkedin.com/in/asthajain12</w:t>
+              <w:t xml:space="preserve">asthaj12.github.io  ·  linkedin.com/in/asthajain12</w:t>
             </w:r>
           </w:p>
           <w:p>
@@ -102,7 +102,7 @@
                 <w:sz w:val="16"/>
                 <w:szCs w:val="16"/>
               </w:rPr>
-              <w:t xml:space="preserve">github.com/ajwalmart12</w:t>
+              <w:t xml:space="preserve">github.com/asthaj12</w:t>
             </w:r>
           </w:p>
         </w:tc>
@@ -1291,7 +1291,7 @@
                 <w:sz w:val="15"/>
                 <w:szCs w:val="15"/>
               </w:rPr>
-              <w:t xml:space="preserve">github.com/ajwalmart12/forecast-governance</w:t>
+              <w:t xml:space="preserve">github.com/asthaj12/forecast-governance</w:t>
             </w:r>
           </w:p>
         </w:tc>
@@ -1356,7 +1356,7 @@
                 <w:sz w:val="15"/>
                 <w:szCs w:val="15"/>
               </w:rPr>
-              <w:t xml:space="preserve">github.com/ajwalmart12/forecast-accuracy</w:t>
+              <w:t xml:space="preserve">github.com/asthaj12/forecast-accuracy</w:t>
             </w:r>
           </w:p>
         </w:tc>
@@ -1421,7 +1421,7 @@
                 <w:sz w:val="15"/>
                 <w:szCs w:val="15"/>
               </w:rPr>
-              <w:t xml:space="preserve">github.com/ajwalmart12/seasonal-planning</w:t>
+              <w:t xml:space="preserve">github.com/asthaj12/seasonal-planning</w:t>
             </w:r>
           </w:p>
         </w:tc>
@@ -1500,7 +1500,7 @@
                 <w:sz w:val="15"/>
                 <w:szCs w:val="15"/>
               </w:rPr>
-              <w:t xml:space="preserve">github.com/ajwalmart12/replenishment-risk</w:t>
+              <w:t xml:space="preserve">github.com/asthaj12/replenishment-risk</w:t>
             </w:r>
           </w:p>
         </w:tc>
@@ -1565,7 +1565,7 @@
                 <w:sz w:val="15"/>
                 <w:szCs w:val="15"/>
               </w:rPr>
-              <w:t xml:space="preserve">github.com/ajwalmart12/logitech-supply-planning</w:t>
+              <w:t xml:space="preserve">github.com/asthaj12/logitech-supply-planning</w:t>
             </w:r>
           </w:p>
         </w:tc>
@@ -1630,7 +1630,7 @@
                 <w:sz w:val="15"/>
                 <w:szCs w:val="15"/>
               </w:rPr>
-              <w:t xml:space="preserve">github.com/ajwalmart12/npi-launch-planning</w:t>
+              <w:t xml:space="preserve">github.com/asthaj12/npi-launch-planning</w:t>
             </w:r>
           </w:p>
         </w:tc>
@@ -1709,7 +1709,7 @@
                 <w:sz w:val="15"/>
                 <w:szCs w:val="15"/>
               </w:rPr>
-              <w:t xml:space="preserve">github.com/ajwalmart12/shopify-demand-forecasting</w:t>
+              <w:t xml:space="preserve">github.com/asthaj12/shopify-demand-forecasting</w:t>
             </w:r>
           </w:p>
         </w:tc>
@@ -1788,7 +1788,7 @@
                 <w:sz w:val="15"/>
                 <w:szCs w:val="15"/>
               </w:rPr>
-              <w:t xml:space="preserve">github.com/ajwalmart12/pricing-demand-response</w:t>
+              <w:t xml:space="preserve">github.com/asthaj12/pricing-demand-response</w:t>
             </w:r>
           </w:p>
         </w:tc>

</xml_diff>

<commit_message>
Fix page fill, font, and DOCX: 8.5pt base + generous spacing, all 6 variants 2pp
HTML (all 6 variants):
- Root cause found: 9pt CSS was making competency rows wrap for 3 variants (npi/
  network/ops), causing experience to overflow page 1 before the edu page break
- Fix: keep 8.5pt/8.2pt base (prevents wrapping), add generous spacing on top:
  li=5px/1.46lh, section=13px, job=15px, header=10px — fills page 1 properly
- Tested: all 6 variants render as exactly 2 pages (Chrome headless confirmed)
- Download URL cache-busted with ?v=20260805

DOCX:
- Font changed Calibri → Arial (matches system-ui web feel)
- Content matches HTML: summary, 3-row competencies, 4 W1 bullets
- Selected Work: real Word hyperlinks (not gray URL text)
- Explicit page break before Education

Co-Authored-By: Wibey Desktop <wibey@walmart.com>
</commit_message>
<xml_diff>
--- a/resumes/Resume-AJ-2026.docx
+++ b/resumes/Resume-AJ-2026.docx
@@ -1373,7 +1373,7 @@
   <w:docDefaults>
     <w:rPrDefault>
       <w:rPr>
-        <w:rFonts w:ascii="Calibri" w:hAnsi="Calibri" w:cs="Calibri"/>
+        <w:rFonts w:ascii="Arial" w:hAnsi="Arial" w:cs="Arial"/>
         <w:sz w:val="19"/>
         <w:szCs w:val="19"/>
         <w:color w:val="1A1A1A"/>
@@ -1388,7 +1388,7 @@
   <w:style w:type="paragraph" w:styleId="Normal" w:default="1">
     <w:name w:val="Normal"/>
     <w:rPr>
-      <w:rFonts w:ascii="Calibri" w:hAnsi="Calibri"/>
+      <w:rFonts w:ascii="Arial" w:hAnsi="Arial"/>
       <w:sz w:val="19"/>
       <w:color w:val="1A1A1A"/>
     </w:rPr>

</xml_diff>

<commit_message>
Regenerate DOCX: match HTML content, fix links to github.io dashboards
- Summary: added $20B+, S&OP/IBP, VP-level stakeholders
- All bullets: dollar figures on every point (wMAPE, in-stock, $20B+, $5B+, $30M, $8M+)
- Selected Work links: github.com → github.io (live dashboards)
- Word hyperlinks work in all PDF viewers including Preview

Co-Authored-By: Wibey Desktop <wibey@walmart.com>
</commit_message>
<xml_diff>
--- a/resumes/Resume-AJ-2026.docx
+++ b/resumes/Resume-AJ-2026.docx
@@ -142,7 +142,7 @@
           <w:sz w:val="18"/>
           <w:szCs w:val="18"/>
         </w:rPr>
-        <w:t xml:space="preserve">Strategic demand planning leader with expertise in time series forecasting, causal inference, and ML-driven anomaly detection — spanning large-scale retail (Walmart US, 5-10B monthly units), e-commerce logistics (Shopify Logistics, $1.1B GMV), and global consumer electronics (Logitech Inc., $400M portfolio). MIT-credentialed in supply chain management; fluent in AI/LLM tools and advanced analytics for demand signal generation and inventory optimization.</w:t>
+        <w:t xml:space="preserve">Strategic demand planning leader with expertise in time series forecasting, causal inference, and ML-driven anomaly detection — spanning large-scale retail (Walmart US, 5-10B monthly units, ~$20B+ monthly demand), e-commerce logistics (Shopify Logistics, $1.1B GMV), and global consumer electronics (Logitech Inc., $400M portfolio). Drives end-to-end S&amp;OP and IBP, translating model outputs into executive-ready inventory strategy and VP-level stakeholder decisions. MIT-credentialed in supply chain management; fluent in AI/LLM tools and advanced analytics.</w:t>
       </w:r>
     </w:p>
     <w:p>
@@ -378,7 +378,7 @@
           <w:sz w:val="18"/>
           <w:szCs w:val="18"/>
         </w:rPr>
-        <w:t xml:space="preserve">Engineered a bias-correction and anomaly-detection pipeline across 5-10B monthly units (4,593 stores), triaging 50K+ weekly signals via automated ML scoring models and driving systematic forecast bias from -20% to near-neutral.</w:t>
+        <w:t xml:space="preserve">Engineered a bias-correction and anomaly-detection pipeline across 5-10B monthly units (~$20B+ monthly demand, 4,593 stores), triaging 50K+ weekly signals; corrected systematic forecast bias from -20% to near-neutral — improving forecast accuracy (bias and wMAPE) and maintaining stable in-stock positions.</w:t>
       </w:r>
     </w:p>
     <w:p>
@@ -409,7 +409,7 @@
           <w:sz w:val="18"/>
           <w:szCs w:val="18"/>
         </w:rPr>
-        <w:t xml:space="preserve">Applied causal inference to size the impact of a 970M-unit SNAP policy change across 24 states — delivering inventory positioning signals 6+ weeks ahead and informing $400M+ in pre-emptive inventory decisions.</w:t>
+        <w:t xml:space="preserve">Applied causal inference to size the impact of a 970M-unit SNAP policy change across 24 states — delivering inventory positioning signals 6+ weeks ahead of impact ($400M+ in pre-emptive inventory decisions).</w:t>
       </w:r>
     </w:p>
     <w:p>
@@ -440,7 +440,7 @@
           <w:sz w:val="18"/>
           <w:szCs w:val="18"/>
         </w:rPr>
-        <w:t xml:space="preserve">Built a statistical ensemble forecasting architecture spanning 14+ retail and seasonal events annually; achieved $292M reduction in forecast error and surfaced $7.6M in anomalous override exposure.</w:t>
+        <w:t xml:space="preserve">Built a statistical ensemble forecasting architecture spanning 14+ retail and seasonal events annually; achieved $292M in forecast error reduction and surfaced $7.6M in anomalous override exposure.</w:t>
       </w:r>
     </w:p>
     <w:p>
@@ -463,15 +463,15 @@
           <w:sz w:val="18"/>
           <w:szCs w:val="18"/>
         </w:rPr>
-        <w:t xml:space="preserve">S&amp;OP &amp; Stakeholder Alignment:  </w:t>
-      </w:r>
-      <w:r>
-        <w:rPr>
-          <w:color w:val="1A1A1A"/>
-          <w:sz w:val="18"/>
-          <w:szCs w:val="18"/>
-        </w:rPr>
-        <w:t xml:space="preserve">Owned end-to-end weekly S&amp;OP / IBP program across Merchandising, Finance, and Operations; delivered executive forecast risk reporting and compressed time-to-decision from ~2 weeks to 3-4 days.</w:t>
+        <w:t xml:space="preserve">S&amp;OP / IBP Leadership:  </w:t>
+      </w:r>
+      <w:r>
+        <w:rPr>
+          <w:color w:val="1A1A1A"/>
+          <w:sz w:val="18"/>
+          <w:szCs w:val="18"/>
+        </w:rPr>
+        <w:t xml:space="preserve">Owned end-to-end weekly S&amp;OP / IBP cycle across Merchandising, Finance, and Operations; compressed ~$5B+ in weekly inventory decisions ~75% (from ~2 weeks to 3-4 days), improving in-stock and forecast accuracy (bias and wMAPE).</w:t>
       </w:r>
     </w:p>
     <w:p>
@@ -639,7 +639,7 @@
           <w:sz w:val="18"/>
           <w:szCs w:val="18"/>
         </w:rPr>
-        <w:t xml:space="preserve">Improved short-horizon accuracy on high-velocity SKUs; reduced merchant stockouts 15% and generated $2M in incremental sales.</w:t>
+        <w:t xml:space="preserve">Improved short-horizon accuracy on high-velocity SKUs; reduced merchant stockouts 15% ($2M in incremental sales).</w:t>
       </w:r>
     </w:p>
     <w:p>
@@ -670,7 +670,7 @@
           <w:sz w:val="18"/>
           <w:szCs w:val="18"/>
         </w:rPr>
-        <w:t xml:space="preserve">Built retrospective accuracy analysis by SKU velocity decile to identify model failure modes; drove ensemble re-weighting that improved forecast accuracy 30% on high-velocity SKUs.</w:t>
+        <w:t xml:space="preserve">Built retrospective accuracy analysis by SKU velocity decile to identify model failure modes; drove ensemble re-weighting that improved forecast accuracy 30% on high-velocity SKUs ($2M revenue impact).</w:t>
       </w:r>
     </w:p>
     <w:p>
@@ -793,7 +793,7 @@
           <w:sz w:val="18"/>
           <w:szCs w:val="18"/>
         </w:rPr>
-        <w:t xml:space="preserve">Managed supply planning for a ~$400M global consumer electronics portfolio (400+ SKUs); stochastic safety-stock models improved availability 40%, cut air freight ~$200K, and reduced E&amp;O costs ~$1M annually.</w:t>
+        <w:t xml:space="preserve">Managed supply planning for 400+ SKUs (~$400M global portfolio); stochastic safety-stock models improved availability 40%, cut air freight ~$200K, and reduced E&amp;O costs ~$1M annually.</w:t>
       </w:r>
     </w:p>
     <w:p>
@@ -824,7 +824,7 @@
           <w:sz w:val="18"/>
           <w:szCs w:val="18"/>
         </w:rPr>
-        <w:t xml:space="preserve">Managed full product lifecycle from NPI through EOL across quarterly cycles with Asia-based ODM partners; led Apple Education Program launch — accelerating delivery 15% (~3 weeks ahead of schedule).</w:t>
+        <w:t xml:space="preserve">Managed full product lifecycle from NPI through EOL across quarterly cycles with Asia-based ODM partners; led ~$30M Apple Education Program launch — accelerating delivery 15% (~3 weeks ahead of schedule).</w:t>
       </w:r>
     </w:p>
     <w:p>
@@ -855,7 +855,7 @@
           <w:sz w:val="18"/>
           <w:szCs w:val="18"/>
         </w:rPr>
-        <w:t xml:space="preserve">Built a demand signal pipeline across DCs in NA, EMEA, and APAC; reduced plan-revision cycles and improved cross-regional S&amp;OP alignment.</w:t>
+        <w:t xml:space="preserve">Built a demand signal pipeline across DCs in NA, EMEA, and APAC (~$400M portfolio); reduced plan-revision cycles and improved cross-regional S&amp;OP alignment, contributing to ~$1M annual E&amp;O cost reduction.</w:t>
       </w:r>
     </w:p>
     <w:p>
@@ -978,7 +978,7 @@
           <w:sz w:val="18"/>
           <w:szCs w:val="18"/>
         </w:rPr>
-        <w:t xml:space="preserve">Built risk models across 800+ global suppliers for 15+ engine lines; dual-sourcing analysis compressed disruption recovery time from 16 to 6 weeks.</w:t>
+        <w:t xml:space="preserve">Built risk models across 800+ global suppliers for 15+ engine lines; dual-sourcing analysis compressed disruption recovery 63% (from 16 to 6 weeks), reducing ~$8M+ in annual production-disruption exposure.</w:t>
       </w:r>
     </w:p>
     <w:p>

</xml_diff>

<commit_message>
Fix DOCX: remove page break, natural flow, no empty space at bottom
Co-Authored-By: Wibey Desktop <wibey@walmart.com>
</commit_message>
<xml_diff>
--- a/resumes/Resume-AJ-2026.docx
+++ b/resumes/Resume-AJ-2026.docx
@@ -982,14 +982,9 @@
       </w:r>
     </w:p>
     <w:p>
-      <w:r>
-        <w:br w:type="page"/>
-      </w:r>
-    </w:p>
-    <w:p>
       <w:pPr>
         <w:keepNext/>
-        <w:spacing w:before="0" w:after="40"/>
+        <w:spacing w:before="80" w:after="40"/>
         <w:pBdr>
           <w:bottom w:val="single" w:sz="4" w:space="2" w:color="C5D8F0"/>
         </w:pBdr>
@@ -1166,7 +1161,7 @@
     <w:p>
       <w:pPr>
         <w:keepNext/>
-        <w:spacing w:before="120" w:after="40"/>
+        <w:spacing w:before="80" w:after="40"/>
         <w:pBdr>
           <w:bottom w:val="single" w:sz="4" w:space="2" w:color="C5D8F0"/>
         </w:pBdr>

</xml_diff>